<commit_message>
Improve SOP deliverable templates
</commit_message>
<xml_diff>
--- a/templates/sequence-diagram-review.docx
+++ b/templates/sequence-diagram-review.docx
@@ -4,182 +4,695 @@
   <w:body>
     <w:p>
       <w:pPr>
-        <w:jc w:val="center"/>
+        <w:spacing w:before="60" w:after="0"/>
       </w:pPr>
       <w:r>
         <w:rPr>
+          <w:rFonts w:ascii="Microsoft YaHei" w:hAnsi="Microsoft YaHei" w:eastAsia="Microsoft YaHei"/>
           <w:b/>
+          <w:i w:val="0"/>
           <w:color w:val="1769E0"/>
-          <w:sz w:val="20"/>
+          <w:sz w:val="19"/>
         </w:rPr>
-        <w:t>实施项目管理平台</w:t>
+        <w:t>SOP · 接口对接</w:t>
       </w:r>
     </w:p>
     <w:p>
       <w:pPr>
-        <w:jc w:val="center"/>
+        <w:keepNext/>
+        <w:spacing w:before="0" w:after="60"/>
       </w:pPr>
       <w:r>
         <w:rPr>
+          <w:rFonts w:ascii="Microsoft YaHei" w:hAnsi="Microsoft YaHei" w:eastAsia="Microsoft YaHei"/>
           <w:b/>
-          <w:color w:val="16365F"/>
-          <w:sz w:val="36"/>
+          <w:i w:val="0"/>
+          <w:color w:val="17365D"/>
+          <w:sz w:val="46"/>
         </w:rPr>
         <w:t>时序图（评审确认版）</w:t>
+      </w:r>
+    </w:p>
+    <w:p>
+      <w:pPr>
+        <w:keepNext/>
+        <w:spacing w:before="0" w:after="180"/>
+      </w:pPr>
+      <w:r>
+        <w:rPr>
+          <w:rFonts w:ascii="Microsoft YaHei" w:hAnsi="Microsoft YaHei" w:eastAsia="Microsoft YaHei"/>
+          <w:b w:val="0"/>
+          <w:i w:val="0"/>
+          <w:color w:val="667A90"/>
+          <w:sz w:val="21"/>
+        </w:rPr>
+        <w:t>用于沉淀跨系统业务时序、关键节点、异常分支与评审结论</w:t>
       </w:r>
     </w:p>
     <w:tbl>
       <w:tblPr>
         <w:tblStyle w:val="TableGrid"/>
-        <w:tblW w:type="auto" w:w="0"/>
-        <w:jc w:val="center"/>
+        <w:tblW w:type="dxa" w:w="14900"/>
+        <w:jc w:val="left"/>
+        <w:tblLayout w:type="fixed"/>
         <w:tblLook w:firstColumn="1" w:firstRow="1" w:lastColumn="0" w:lastRow="0" w:noHBand="0" w:noVBand="1" w:val="04A0"/>
+        <w:tblInd w:w="120" w:type="dxa"/>
+        <w:tblBorders>
+          <w:top w:val="single" w:sz="5" w:color="C8D8EA"/>
+          <w:left w:val="single" w:sz="5" w:color="C8D8EA"/>
+          <w:bottom w:val="single" w:sz="5" w:color="C8D8EA"/>
+          <w:right w:val="single" w:sz="5" w:color="C8D8EA"/>
+          <w:insideH w:val="single" w:sz="5" w:color="C8D8EA"/>
+          <w:insideV w:val="single" w:sz="5" w:color="C8D8EA"/>
+        </w:tblBorders>
       </w:tblPr>
       <w:tblGrid>
-        <w:gridCol w:w="2592"/>
-        <w:gridCol w:w="2592"/>
-        <w:gridCol w:w="2592"/>
-        <w:gridCol w:w="2592"/>
+        <w:gridCol w:w="1192"/>
+        <w:gridCol w:w="2566"/>
+        <w:gridCol w:w="1192"/>
+        <w:gridCol w:w="2566"/>
+        <w:gridCol w:w="1192"/>
+        <w:gridCol w:w="2235"/>
+        <w:gridCol w:w="1192"/>
+        <w:gridCol w:w="2765"/>
       </w:tblGrid>
       <w:tr>
+        <w:trPr>
+          <w:cantSplit/>
+        </w:trPr>
         <w:tc>
           <w:tcPr>
-            <w:tcW w:type="dxa" w:w="2592"/>
+            <w:tcW w:type="dxa" w:w="1192"/>
+            <w:shd w:fill="EDF5FF"/>
             <w:vAlign w:val="center"/>
+            <w:tcMar>
+              <w:top w:w="80" w:type="dxa"/>
+              <w:start w:w="120" w:type="dxa"/>
+              <w:bottom w:w="80" w:type="dxa"/>
+              <w:end w:w="120" w:type="dxa"/>
+            </w:tcMar>
           </w:tcPr>
           <w:p>
+            <w:pPr>
+              <w:spacing w:before="40" w:after="40" w:line="276" w:lineRule="auto"/>
+              <w:jc w:val="center"/>
+            </w:pPr>
+            <w:r/>
             <w:r>
-              <w:t>项目名称：</w:t>
+              <w:rPr>
+                <w:rFonts w:ascii="Microsoft YaHei" w:hAnsi="Microsoft YaHei" w:eastAsia="Microsoft YaHei"/>
+                <w:b/>
+                <w:i w:val="0"/>
+                <w:color w:val="17365D"/>
+                <w:sz w:val="18"/>
+              </w:rPr>
+              <w:t>项目名称</w:t>
             </w:r>
           </w:p>
         </w:tc>
         <w:tc>
           <w:tcPr>
-            <w:tcW w:type="dxa" w:w="2592"/>
+            <w:tcW w:type="dxa" w:w="2566"/>
+            <w:shd w:fill="FFF9E8"/>
             <w:vAlign w:val="center"/>
+            <w:tcMar>
+              <w:top w:w="80" w:type="dxa"/>
+              <w:start w:w="120" w:type="dxa"/>
+              <w:bottom w:w="80" w:type="dxa"/>
+              <w:end w:w="120" w:type="dxa"/>
+            </w:tcMar>
           </w:tcPr>
           <w:p>
+            <w:pPr>
+              <w:spacing w:before="40" w:after="40" w:line="276" w:lineRule="auto"/>
+              <w:jc w:val="left"/>
+            </w:pPr>
+            <w:r/>
             <w:r>
-              <w:t>客户：</w:t>
+              <w:rPr>
+                <w:rFonts w:ascii="Microsoft YaHei" w:hAnsi="Microsoft YaHei" w:eastAsia="Microsoft YaHei"/>
+                <w:b w:val="0"/>
+                <w:i w:val="0"/>
+                <w:color w:val="24364B"/>
+                <w:sz w:val="18"/>
+              </w:rPr>
             </w:r>
           </w:p>
         </w:tc>
         <w:tc>
           <w:tcPr>
-            <w:tcW w:type="dxa" w:w="2592"/>
+            <w:tcW w:type="dxa" w:w="1192"/>
+            <w:shd w:fill="EDF5FF"/>
             <w:vAlign w:val="center"/>
+            <w:tcMar>
+              <w:top w:w="80" w:type="dxa"/>
+              <w:start w:w="120" w:type="dxa"/>
+              <w:bottom w:w="80" w:type="dxa"/>
+              <w:end w:w="120" w:type="dxa"/>
+            </w:tcMar>
           </w:tcPr>
           <w:p>
+            <w:pPr>
+              <w:spacing w:before="40" w:after="40" w:line="276" w:lineRule="auto"/>
+              <w:jc w:val="center"/>
+            </w:pPr>
+            <w:r/>
             <w:r>
-              <w:t>负责人：</w:t>
+              <w:rPr>
+                <w:rFonts w:ascii="Microsoft YaHei" w:hAnsi="Microsoft YaHei" w:eastAsia="Microsoft YaHei"/>
+                <w:b/>
+                <w:i w:val="0"/>
+                <w:color w:val="17365D"/>
+                <w:sz w:val="18"/>
+              </w:rPr>
+              <w:t>客户单位</w:t>
             </w:r>
           </w:p>
         </w:tc>
         <w:tc>
           <w:tcPr>
-            <w:tcW w:type="dxa" w:w="2592"/>
+            <w:tcW w:type="dxa" w:w="2566"/>
+            <w:shd w:fill="FFF9E8"/>
             <w:vAlign w:val="center"/>
+            <w:tcMar>
+              <w:top w:w="80" w:type="dxa"/>
+              <w:start w:w="120" w:type="dxa"/>
+              <w:bottom w:w="80" w:type="dxa"/>
+              <w:end w:w="120" w:type="dxa"/>
+            </w:tcMar>
           </w:tcPr>
           <w:p>
+            <w:pPr>
+              <w:spacing w:before="40" w:after="40" w:line="276" w:lineRule="auto"/>
+              <w:jc w:val="left"/>
+            </w:pPr>
+            <w:r/>
             <w:r>
-              <w:t>模板版本：V1.0</w:t>
+              <w:rPr>
+                <w:rFonts w:ascii="Microsoft YaHei" w:hAnsi="Microsoft YaHei" w:eastAsia="Microsoft YaHei"/>
+                <w:b w:val="0"/>
+                <w:i w:val="0"/>
+                <w:color w:val="24364B"/>
+                <w:sz w:val="18"/>
+              </w:rPr>
+            </w:r>
+          </w:p>
+        </w:tc>
+        <w:tc>
+          <w:tcPr>
+            <w:tcW w:type="dxa" w:w="1192"/>
+            <w:shd w:fill="EDF5FF"/>
+            <w:vAlign w:val="center"/>
+            <w:tcMar>
+              <w:top w:w="80" w:type="dxa"/>
+              <w:start w:w="120" w:type="dxa"/>
+              <w:bottom w:w="80" w:type="dxa"/>
+              <w:end w:w="120" w:type="dxa"/>
+            </w:tcMar>
+          </w:tcPr>
+          <w:p>
+            <w:pPr>
+              <w:spacing w:before="40" w:after="40" w:line="276" w:lineRule="auto"/>
+              <w:jc w:val="center"/>
+            </w:pPr>
+            <w:r/>
+            <w:r>
+              <w:rPr>
+                <w:rFonts w:ascii="Microsoft YaHei" w:hAnsi="Microsoft YaHei" w:eastAsia="Microsoft YaHei"/>
+                <w:b/>
+                <w:i w:val="0"/>
+                <w:color w:val="17365D"/>
+                <w:sz w:val="18"/>
+              </w:rPr>
+              <w:t>项目经理</w:t>
+            </w:r>
+          </w:p>
+        </w:tc>
+        <w:tc>
+          <w:tcPr>
+            <w:tcW w:type="dxa" w:w="2235"/>
+            <w:shd w:fill="FFF9E8"/>
+            <w:vAlign w:val="center"/>
+            <w:tcMar>
+              <w:top w:w="80" w:type="dxa"/>
+              <w:start w:w="120" w:type="dxa"/>
+              <w:bottom w:w="80" w:type="dxa"/>
+              <w:end w:w="120" w:type="dxa"/>
+            </w:tcMar>
+          </w:tcPr>
+          <w:p>
+            <w:pPr>
+              <w:spacing w:before="40" w:after="40" w:line="276" w:lineRule="auto"/>
+              <w:jc w:val="left"/>
+            </w:pPr>
+            <w:r/>
+            <w:r>
+              <w:rPr>
+                <w:rFonts w:ascii="Microsoft YaHei" w:hAnsi="Microsoft YaHei" w:eastAsia="Microsoft YaHei"/>
+                <w:b w:val="0"/>
+                <w:i w:val="0"/>
+                <w:color w:val="24364B"/>
+                <w:sz w:val="18"/>
+              </w:rPr>
+            </w:r>
+          </w:p>
+        </w:tc>
+        <w:tc>
+          <w:tcPr>
+            <w:tcW w:type="dxa" w:w="1192"/>
+            <w:shd w:fill="EDF5FF"/>
+            <w:vAlign w:val="center"/>
+            <w:tcMar>
+              <w:top w:w="80" w:type="dxa"/>
+              <w:start w:w="120" w:type="dxa"/>
+              <w:bottom w:w="80" w:type="dxa"/>
+              <w:end w:w="120" w:type="dxa"/>
+            </w:tcMar>
+          </w:tcPr>
+          <w:p>
+            <w:pPr>
+              <w:spacing w:before="40" w:after="40" w:line="276" w:lineRule="auto"/>
+              <w:jc w:val="center"/>
+            </w:pPr>
+            <w:r/>
+            <w:r>
+              <w:rPr>
+                <w:rFonts w:ascii="Microsoft YaHei" w:hAnsi="Microsoft YaHei" w:eastAsia="Microsoft YaHei"/>
+                <w:b/>
+                <w:i w:val="0"/>
+                <w:color w:val="17365D"/>
+                <w:sz w:val="18"/>
+              </w:rPr>
+              <w:t>文档编号</w:t>
+            </w:r>
+          </w:p>
+        </w:tc>
+        <w:tc>
+          <w:tcPr>
+            <w:tcW w:type="dxa" w:w="2765"/>
+            <w:shd w:fill="FFF9E8"/>
+            <w:vAlign w:val="center"/>
+            <w:tcMar>
+              <w:top w:w="80" w:type="dxa"/>
+              <w:start w:w="120" w:type="dxa"/>
+              <w:bottom w:w="80" w:type="dxa"/>
+              <w:end w:w="120" w:type="dxa"/>
+            </w:tcMar>
+          </w:tcPr>
+          <w:p>
+            <w:pPr>
+              <w:spacing w:before="40" w:after="40" w:line="276" w:lineRule="auto"/>
+              <w:jc w:val="left"/>
+            </w:pPr>
+            <w:r/>
+            <w:r>
+              <w:rPr>
+                <w:rFonts w:ascii="Microsoft YaHei" w:hAnsi="Microsoft YaHei" w:eastAsia="Microsoft YaHei"/>
+                <w:b w:val="0"/>
+                <w:i w:val="0"/>
+                <w:color w:val="24364B"/>
+                <w:sz w:val="18"/>
+              </w:rPr>
             </w:r>
           </w:p>
         </w:tc>
       </w:tr>
       <w:tr>
+        <w:trPr>
+          <w:cantSplit/>
+        </w:trPr>
         <w:tc>
           <w:tcPr>
-            <w:tcW w:type="dxa" w:w="2592"/>
+            <w:tcW w:type="dxa" w:w="1192"/>
+            <w:shd w:fill="EDF5FF"/>
             <w:vAlign w:val="center"/>
+            <w:tcMar>
+              <w:top w:w="80" w:type="dxa"/>
+              <w:start w:w="120" w:type="dxa"/>
+              <w:bottom w:w="80" w:type="dxa"/>
+              <w:end w:w="120" w:type="dxa"/>
+            </w:tcMar>
           </w:tcPr>
           <w:p>
+            <w:pPr>
+              <w:spacing w:before="40" w:after="40" w:line="276" w:lineRule="auto"/>
+              <w:jc w:val="center"/>
+            </w:pPr>
+            <w:r/>
             <w:r>
-              <w:t>文档编号：</w:t>
+              <w:rPr>
+                <w:rFonts w:ascii="Microsoft YaHei" w:hAnsi="Microsoft YaHei" w:eastAsia="Microsoft YaHei"/>
+                <w:b/>
+                <w:i w:val="0"/>
+                <w:color w:val="17365D"/>
+                <w:sz w:val="18"/>
+              </w:rPr>
+              <w:t>实施负责人</w:t>
             </w:r>
           </w:p>
         </w:tc>
         <w:tc>
           <w:tcPr>
-            <w:tcW w:type="dxa" w:w="2592"/>
+            <w:tcW w:type="dxa" w:w="2566"/>
+            <w:shd w:fill="FFF9E8"/>
             <w:vAlign w:val="center"/>
+            <w:tcMar>
+              <w:top w:w="80" w:type="dxa"/>
+              <w:start w:w="120" w:type="dxa"/>
+              <w:bottom w:w="80" w:type="dxa"/>
+              <w:end w:w="120" w:type="dxa"/>
+            </w:tcMar>
           </w:tcPr>
           <w:p>
+            <w:pPr>
+              <w:spacing w:before="40" w:after="40" w:line="276" w:lineRule="auto"/>
+              <w:jc w:val="left"/>
+            </w:pPr>
+            <w:r/>
             <w:r>
-              <w:t>填写日期：</w:t>
+              <w:rPr>
+                <w:rFonts w:ascii="Microsoft YaHei" w:hAnsi="Microsoft YaHei" w:eastAsia="Microsoft YaHei"/>
+                <w:b w:val="0"/>
+                <w:i w:val="0"/>
+                <w:color w:val="24364B"/>
+                <w:sz w:val="18"/>
+              </w:rPr>
             </w:r>
           </w:p>
         </w:tc>
         <w:tc>
           <w:tcPr>
-            <w:tcW w:type="dxa" w:w="2592"/>
+            <w:tcW w:type="dxa" w:w="1192"/>
+            <w:shd w:fill="EDF5FF"/>
             <w:vAlign w:val="center"/>
+            <w:tcMar>
+              <w:top w:w="80" w:type="dxa"/>
+              <w:start w:w="120" w:type="dxa"/>
+              <w:bottom w:w="80" w:type="dxa"/>
+              <w:end w:w="120" w:type="dxa"/>
+            </w:tcMar>
           </w:tcPr>
           <w:p>
+            <w:pPr>
+              <w:spacing w:before="40" w:after="40" w:line="276" w:lineRule="auto"/>
+              <w:jc w:val="center"/>
+            </w:pPr>
+            <w:r/>
             <w:r>
-              <w:t>审核人：</w:t>
+              <w:rPr>
+                <w:rFonts w:ascii="Microsoft YaHei" w:hAnsi="Microsoft YaHei" w:eastAsia="Microsoft YaHei"/>
+                <w:b/>
+                <w:i w:val="0"/>
+                <w:color w:val="17365D"/>
+                <w:sz w:val="18"/>
+              </w:rPr>
+              <w:t>编制日期</w:t>
             </w:r>
           </w:p>
         </w:tc>
         <w:tc>
           <w:tcPr>
-            <w:tcW w:type="dxa" w:w="2592"/>
+            <w:tcW w:type="dxa" w:w="2566"/>
+            <w:shd w:fill="FFF9E8"/>
             <w:vAlign w:val="center"/>
+            <w:tcMar>
+              <w:top w:w="80" w:type="dxa"/>
+              <w:start w:w="120" w:type="dxa"/>
+              <w:bottom w:w="80" w:type="dxa"/>
+              <w:end w:w="120" w:type="dxa"/>
+            </w:tcMar>
           </w:tcPr>
           <w:p>
+            <w:pPr>
+              <w:spacing w:before="40" w:after="40" w:line="276" w:lineRule="auto"/>
+              <w:jc w:val="left"/>
+            </w:pPr>
+            <w:r/>
             <w:r>
-              <w:t>状态：□草稿  □已确认</w:t>
+              <w:rPr>
+                <w:rFonts w:ascii="Microsoft YaHei" w:hAnsi="Microsoft YaHei" w:eastAsia="Microsoft YaHei"/>
+                <w:b w:val="0"/>
+                <w:i w:val="0"/>
+                <w:color w:val="24364B"/>
+                <w:sz w:val="18"/>
+              </w:rPr>
+            </w:r>
+          </w:p>
+        </w:tc>
+        <w:tc>
+          <w:tcPr>
+            <w:tcW w:type="dxa" w:w="1192"/>
+            <w:shd w:fill="EDF5FF"/>
+            <w:vAlign w:val="center"/>
+            <w:tcMar>
+              <w:top w:w="80" w:type="dxa"/>
+              <w:start w:w="120" w:type="dxa"/>
+              <w:bottom w:w="80" w:type="dxa"/>
+              <w:end w:w="120" w:type="dxa"/>
+            </w:tcMar>
+          </w:tcPr>
+          <w:p>
+            <w:pPr>
+              <w:spacing w:before="40" w:after="40" w:line="276" w:lineRule="auto"/>
+              <w:jc w:val="center"/>
+            </w:pPr>
+            <w:r/>
+            <w:r>
+              <w:rPr>
+                <w:rFonts w:ascii="Microsoft YaHei" w:hAnsi="Microsoft YaHei" w:eastAsia="Microsoft YaHei"/>
+                <w:b/>
+                <w:i w:val="0"/>
+                <w:color w:val="17365D"/>
+                <w:sz w:val="18"/>
+              </w:rPr>
+              <w:t>模板版本</w:t>
+            </w:r>
+          </w:p>
+        </w:tc>
+        <w:tc>
+          <w:tcPr>
+            <w:tcW w:type="dxa" w:w="2235"/>
+            <w:shd w:fill="FFFFFF"/>
+            <w:vAlign w:val="center"/>
+            <w:tcMar>
+              <w:top w:w="80" w:type="dxa"/>
+              <w:start w:w="120" w:type="dxa"/>
+              <w:bottom w:w="80" w:type="dxa"/>
+              <w:end w:w="120" w:type="dxa"/>
+            </w:tcMar>
+          </w:tcPr>
+          <w:p>
+            <w:pPr>
+              <w:spacing w:before="40" w:after="40" w:line="276" w:lineRule="auto"/>
+              <w:jc w:val="left"/>
+            </w:pPr>
+            <w:r/>
+            <w:r>
+              <w:rPr>
+                <w:rFonts w:ascii="Microsoft YaHei" w:hAnsi="Microsoft YaHei" w:eastAsia="Microsoft YaHei"/>
+                <w:b w:val="0"/>
+                <w:i w:val="0"/>
+                <w:color w:val="24364B"/>
+                <w:sz w:val="18"/>
+              </w:rPr>
+              <w:t>V2.0</w:t>
+            </w:r>
+          </w:p>
+        </w:tc>
+        <w:tc>
+          <w:tcPr>
+            <w:tcW w:type="dxa" w:w="1192"/>
+            <w:shd w:fill="EDF5FF"/>
+            <w:vAlign w:val="center"/>
+            <w:tcMar>
+              <w:top w:w="80" w:type="dxa"/>
+              <w:start w:w="120" w:type="dxa"/>
+              <w:bottom w:w="80" w:type="dxa"/>
+              <w:end w:w="120" w:type="dxa"/>
+            </w:tcMar>
+          </w:tcPr>
+          <w:p>
+            <w:pPr>
+              <w:spacing w:before="40" w:after="40" w:line="276" w:lineRule="auto"/>
+              <w:jc w:val="center"/>
+            </w:pPr>
+            <w:r/>
+            <w:r>
+              <w:rPr>
+                <w:rFonts w:ascii="Microsoft YaHei" w:hAnsi="Microsoft YaHei" w:eastAsia="Microsoft YaHei"/>
+                <w:b/>
+                <w:i w:val="0"/>
+                <w:color w:val="17365D"/>
+                <w:sz w:val="18"/>
+              </w:rPr>
+              <w:t>文档状态</w:t>
+            </w:r>
+          </w:p>
+        </w:tc>
+        <w:tc>
+          <w:tcPr>
+            <w:tcW w:type="dxa" w:w="2765"/>
+            <w:shd w:fill="FFFFFF"/>
+            <w:vAlign w:val="center"/>
+            <w:tcMar>
+              <w:top w:w="80" w:type="dxa"/>
+              <w:start w:w="120" w:type="dxa"/>
+              <w:bottom w:w="80" w:type="dxa"/>
+              <w:end w:w="120" w:type="dxa"/>
+            </w:tcMar>
+          </w:tcPr>
+          <w:p>
+            <w:pPr>
+              <w:spacing w:before="40" w:after="40" w:line="276" w:lineRule="auto"/>
+              <w:jc w:val="left"/>
+            </w:pPr>
+            <w:r/>
+            <w:r>
+              <w:rPr>
+                <w:rFonts w:ascii="Microsoft YaHei" w:hAnsi="Microsoft YaHei" w:eastAsia="Microsoft YaHei"/>
+                <w:b w:val="0"/>
+                <w:i w:val="0"/>
+                <w:color w:val="24364B"/>
+                <w:sz w:val="18"/>
+              </w:rPr>
+              <w:t>☐ 草稿  ☐ 已确认</w:t>
+            </w:r>
+          </w:p>
+        </w:tc>
+      </w:tr>
+    </w:tbl>
+    <w:tbl>
+      <w:tblPr>
+        <w:tblStyle w:val="TableGrid"/>
+        <w:tblW w:type="dxa" w:w="14900"/>
+        <w:jc w:val="left"/>
+        <w:tblLayout w:type="fixed"/>
+        <w:tblLook w:firstColumn="1" w:firstRow="1" w:lastColumn="0" w:lastRow="0" w:noHBand="0" w:noVBand="1" w:val="04A0"/>
+        <w:tblInd w:w="120" w:type="dxa"/>
+        <w:tblBorders>
+          <w:top w:val="single" w:sz="5" w:color="B7D2F1"/>
+          <w:left w:val="single" w:sz="5" w:color="B7D2F1"/>
+          <w:bottom w:val="single" w:sz="5" w:color="B7D2F1"/>
+          <w:right w:val="single" w:sz="5" w:color="B7D2F1"/>
+          <w:insideH w:val="single" w:sz="5" w:color="B7D2F1"/>
+          <w:insideV w:val="single" w:sz="5" w:color="B7D2F1"/>
+        </w:tblBorders>
+      </w:tblPr>
+      <w:tblGrid>
+        <w:gridCol w:w="14900"/>
+      </w:tblGrid>
+      <w:tr>
+        <w:trPr>
+          <w:cantSplit/>
+        </w:trPr>
+        <w:tc>
+          <w:tcPr>
+            <w:tcW w:type="dxa" w:w="14900"/>
+            <w:shd w:fill="F6F9FD"/>
+            <w:vAlign w:val="center"/>
+            <w:tcMar>
+              <w:top w:w="80" w:type="dxa"/>
+              <w:start w:w="120" w:type="dxa"/>
+              <w:bottom w:w="80" w:type="dxa"/>
+              <w:end w:w="120" w:type="dxa"/>
+            </w:tcMar>
+          </w:tcPr>
+          <w:p>
+            <w:pPr>
+              <w:spacing w:before="40" w:after="40" w:line="276" w:lineRule="auto"/>
+              <w:jc w:val="left"/>
+            </w:pPr>
+            <w:r>
+              <w:rPr>
+                <w:b w:val="0"/>
+              </w:rPr>
+            </w:r>
+            <w:r>
+              <w:rPr>
+                <w:rFonts w:ascii="Microsoft YaHei" w:hAnsi="Microsoft YaHei" w:eastAsia="Microsoft YaHei"/>
+                <w:b w:val="0"/>
+                <w:i w:val="0"/>
+                <w:color w:val="24364B"/>
+                <w:sz w:val="18"/>
+              </w:rPr>
+              <w:t>填写提示  |  请将最终时序图粘贴至图示区或作为附件引用，并在评审记录中明确版本、结论和未决事项。</w:t>
             </w:r>
           </w:p>
         </w:tc>
       </w:tr>
     </w:tbl>
     <w:p>
+      <w:pPr>
+        <w:pStyle w:val="Heading2"/>
+        <w:keepNext/>
+      </w:pPr>
       <w:r>
-        <w:t>填写说明：请依据项目实际情况填写，涉及确认的内容应由责任方签字或确认。</w:t>
+        <w:rPr>
+          <w:rFonts w:ascii="Microsoft YaHei" w:hAnsi="Microsoft YaHei" w:eastAsia="Microsoft YaHei"/>
+          <w:b/>
+          <w:i w:val="0"/>
+          <w:color w:val="1769E0"/>
+          <w:sz w:val="26"/>
+        </w:rPr>
+        <w:t>一、范围与基本信息</w:t>
       </w:r>
     </w:p>
     <w:tbl>
       <w:tblPr>
         <w:tblStyle w:val="TableGrid"/>
-        <w:tblW w:type="auto" w:w="0"/>
-        <w:jc w:val="center"/>
+        <w:tblW w:type="dxa" w:w="14900"/>
+        <w:jc w:val="left"/>
+        <w:tblLayout w:type="fixed"/>
         <w:tblLook w:firstColumn="1" w:firstRow="1" w:lastColumn="0" w:lastRow="0" w:noHBand="0" w:noVBand="1" w:val="04A0"/>
+        <w:tblInd w:w="120" w:type="dxa"/>
+        <w:tblBorders>
+          <w:top w:val="single" w:sz="5" w:color="C8D8EA"/>
+          <w:left w:val="single" w:sz="5" w:color="C8D8EA"/>
+          <w:bottom w:val="single" w:sz="5" w:color="C8D8EA"/>
+          <w:right w:val="single" w:sz="5" w:color="C8D8EA"/>
+          <w:insideH w:val="single" w:sz="5" w:color="C8D8EA"/>
+          <w:insideV w:val="single" w:sz="5" w:color="C8D8EA"/>
+        </w:tblBorders>
       </w:tblPr>
       <w:tblGrid>
-        <w:gridCol w:w="1296"/>
-        <w:gridCol w:w="1296"/>
-        <w:gridCol w:w="1296"/>
-        <w:gridCol w:w="1296"/>
-        <w:gridCol w:w="1296"/>
-        <w:gridCol w:w="1296"/>
-        <w:gridCol w:w="1296"/>
-        <w:gridCol w:w="1296"/>
+        <w:gridCol w:w="1215"/>
+        <w:gridCol w:w="2510"/>
+        <w:gridCol w:w="1215"/>
+        <w:gridCol w:w="2510"/>
+        <w:gridCol w:w="1215"/>
+        <w:gridCol w:w="2510"/>
+        <w:gridCol w:w="1215"/>
+        <w:gridCol w:w="2510"/>
       </w:tblGrid>
       <w:tr>
+        <w:trPr>
+          <w:cantSplit/>
+        </w:trPr>
         <w:tc>
           <w:tcPr>
-            <w:tcW w:type="dxa" w:w="1296"/>
-            <w:shd w:fill="DCEBFA"/>
+            <w:tcW w:type="dxa" w:w="1215"/>
+            <w:shd w:fill="EDF5FF"/>
+            <w:vAlign w:val="center"/>
+            <w:tcMar>
+              <w:top w:w="80" w:type="dxa"/>
+              <w:start w:w="120" w:type="dxa"/>
+              <w:bottom w:w="80" w:type="dxa"/>
+              <w:end w:w="120" w:type="dxa"/>
+            </w:tcMar>
           </w:tcPr>
           <w:p>
+            <w:pPr>
+              <w:spacing w:before="40" w:after="40" w:line="276" w:lineRule="auto"/>
+              <w:jc w:val="center"/>
+            </w:pPr>
+            <w:r/>
             <w:r>
               <w:rPr>
+                <w:rFonts w:ascii="Microsoft YaHei" w:hAnsi="Microsoft YaHei" w:eastAsia="Microsoft YaHei"/>
                 <w:b/>
-              </w:rPr>
-              <w:t>图名称</w:t>
-            </w:r>
-          </w:p>
-        </w:tc>
-        <w:tc>
-          <w:tcPr>
-            <w:tcW w:type="dxa" w:w="1296"/>
-            <w:shd w:fill="DCEBFA"/>
-          </w:tcPr>
-          <w:p>
-            <w:r>
-              <w:rPr>
-                <w:b/>
+                <w:i w:val="0"/>
+                <w:color w:val="17365D"/>
+                <w:sz w:val="17"/>
               </w:rPr>
               <w:t>业务场景</w:t>
             </w:r>
@@ -187,13 +700,117 @@
         </w:tc>
         <w:tc>
           <w:tcPr>
-            <w:tcW w:type="dxa" w:w="1296"/>
-            <w:shd w:fill="DCEBFA"/>
+            <w:tcW w:type="dxa" w:w="2510"/>
+            <w:shd w:fill="FFF9E8"/>
+            <w:vAlign w:val="center"/>
+            <w:tcMar>
+              <w:top w:w="80" w:type="dxa"/>
+              <w:start w:w="120" w:type="dxa"/>
+              <w:bottom w:w="80" w:type="dxa"/>
+              <w:end w:w="120" w:type="dxa"/>
+            </w:tcMar>
           </w:tcPr>
           <w:p>
+            <w:pPr>
+              <w:spacing w:before="40" w:after="40" w:line="276" w:lineRule="auto"/>
+              <w:jc w:val="left"/>
+            </w:pPr>
+            <w:r/>
             <w:r>
               <w:rPr>
+                <w:rFonts w:ascii="Microsoft YaHei" w:hAnsi="Microsoft YaHei" w:eastAsia="Microsoft YaHei"/>
+                <w:b w:val="0"/>
+                <w:i w:val="0"/>
+                <w:color w:val="24364B"/>
+                <w:sz w:val="17"/>
+              </w:rPr>
+            </w:r>
+          </w:p>
+        </w:tc>
+        <w:tc>
+          <w:tcPr>
+            <w:tcW w:type="dxa" w:w="1215"/>
+            <w:shd w:fill="EDF5FF"/>
+            <w:vAlign w:val="center"/>
+            <w:tcMar>
+              <w:top w:w="80" w:type="dxa"/>
+              <w:start w:w="120" w:type="dxa"/>
+              <w:bottom w:w="80" w:type="dxa"/>
+              <w:end w:w="120" w:type="dxa"/>
+            </w:tcMar>
+          </w:tcPr>
+          <w:p>
+            <w:pPr>
+              <w:spacing w:before="40" w:after="40" w:line="276" w:lineRule="auto"/>
+              <w:jc w:val="center"/>
+            </w:pPr>
+            <w:r/>
+            <w:r>
+              <w:rPr>
+                <w:rFonts w:ascii="Microsoft YaHei" w:hAnsi="Microsoft YaHei" w:eastAsia="Microsoft YaHei"/>
                 <w:b/>
+                <w:i w:val="0"/>
+                <w:color w:val="17365D"/>
+                <w:sz w:val="17"/>
+              </w:rPr>
+              <w:t>图示版本</w:t>
+            </w:r>
+          </w:p>
+        </w:tc>
+        <w:tc>
+          <w:tcPr>
+            <w:tcW w:type="dxa" w:w="2510"/>
+            <w:shd w:fill="FFF9E8"/>
+            <w:vAlign w:val="center"/>
+            <w:tcMar>
+              <w:top w:w="80" w:type="dxa"/>
+              <w:start w:w="120" w:type="dxa"/>
+              <w:bottom w:w="80" w:type="dxa"/>
+              <w:end w:w="120" w:type="dxa"/>
+            </w:tcMar>
+          </w:tcPr>
+          <w:p>
+            <w:pPr>
+              <w:spacing w:before="40" w:after="40" w:line="276" w:lineRule="auto"/>
+              <w:jc w:val="left"/>
+            </w:pPr>
+            <w:r/>
+            <w:r>
+              <w:rPr>
+                <w:rFonts w:ascii="Microsoft YaHei" w:hAnsi="Microsoft YaHei" w:eastAsia="Microsoft YaHei"/>
+                <w:b w:val="0"/>
+                <w:i w:val="0"/>
+                <w:color w:val="24364B"/>
+                <w:sz w:val="17"/>
+              </w:rPr>
+            </w:r>
+          </w:p>
+        </w:tc>
+        <w:tc>
+          <w:tcPr>
+            <w:tcW w:type="dxa" w:w="1215"/>
+            <w:shd w:fill="EDF5FF"/>
+            <w:vAlign w:val="center"/>
+            <w:tcMar>
+              <w:top w:w="80" w:type="dxa"/>
+              <w:start w:w="120" w:type="dxa"/>
+              <w:bottom w:w="80" w:type="dxa"/>
+              <w:end w:w="120" w:type="dxa"/>
+            </w:tcMar>
+          </w:tcPr>
+          <w:p>
+            <w:pPr>
+              <w:spacing w:before="40" w:after="40" w:line="276" w:lineRule="auto"/>
+              <w:jc w:val="center"/>
+            </w:pPr>
+            <w:r/>
+            <w:r>
+              <w:rPr>
+                <w:rFonts w:ascii="Microsoft YaHei" w:hAnsi="Microsoft YaHei" w:eastAsia="Microsoft YaHei"/>
+                <w:b/>
+                <w:i w:val="0"/>
+                <w:color w:val="17365D"/>
+                <w:sz w:val="17"/>
               </w:rPr>
               <w:t>参与系统</w:t>
             </w:r>
@@ -201,41 +818,58 @@
         </w:tc>
         <w:tc>
           <w:tcPr>
-            <w:tcW w:type="dxa" w:w="1296"/>
-            <w:shd w:fill="DCEBFA"/>
+            <w:tcW w:type="dxa" w:w="2510"/>
+            <w:shd w:fill="FFF9E8"/>
+            <w:vAlign w:val="center"/>
+            <w:tcMar>
+              <w:top w:w="80" w:type="dxa"/>
+              <w:start w:w="120" w:type="dxa"/>
+              <w:bottom w:w="80" w:type="dxa"/>
+              <w:end w:w="120" w:type="dxa"/>
+            </w:tcMar>
           </w:tcPr>
           <w:p>
+            <w:pPr>
+              <w:spacing w:before="40" w:after="40" w:line="276" w:lineRule="auto"/>
+              <w:jc w:val="left"/>
+            </w:pPr>
+            <w:r/>
             <w:r>
               <w:rPr>
-                <w:b/>
+                <w:rFonts w:ascii="Microsoft YaHei" w:hAnsi="Microsoft YaHei" w:eastAsia="Microsoft YaHei"/>
+                <w:b w:val="0"/>
+                <w:i w:val="0"/>
+                <w:color w:val="24364B"/>
+                <w:sz w:val="17"/>
               </w:rPr>
-              <w:t>版本</w:t>
             </w:r>
           </w:p>
         </w:tc>
         <w:tc>
           <w:tcPr>
-            <w:tcW w:type="dxa" w:w="1296"/>
-            <w:shd w:fill="DCEBFA"/>
+            <w:tcW w:type="dxa" w:w="1215"/>
+            <w:shd w:fill="EDF5FF"/>
+            <w:vAlign w:val="center"/>
+            <w:tcMar>
+              <w:top w:w="80" w:type="dxa"/>
+              <w:start w:w="120" w:type="dxa"/>
+              <w:bottom w:w="80" w:type="dxa"/>
+              <w:end w:w="120" w:type="dxa"/>
+            </w:tcMar>
           </w:tcPr>
           <w:p>
+            <w:pPr>
+              <w:spacing w:before="40" w:after="40" w:line="276" w:lineRule="auto"/>
+              <w:jc w:val="center"/>
+            </w:pPr>
+            <w:r/>
             <w:r>
               <w:rPr>
+                <w:rFonts w:ascii="Microsoft YaHei" w:hAnsi="Microsoft YaHei" w:eastAsia="Microsoft YaHei"/>
                 <w:b/>
-              </w:rPr>
-              <w:t>评审人</w:t>
-            </w:r>
-          </w:p>
-        </w:tc>
-        <w:tc>
-          <w:tcPr>
-            <w:tcW w:type="dxa" w:w="1296"/>
-            <w:shd w:fill="DCEBFA"/>
-          </w:tcPr>
-          <w:p>
-            <w:r>
-              <w:rPr>
-                <w:b/>
+                <w:i w:val="0"/>
+                <w:color w:val="17365D"/>
+                <w:sz w:val="17"/>
               </w:rPr>
               <w:t>评审日期</w:t>
             </w:r>
@@ -243,593 +877,3342 @@
         </w:tc>
         <w:tc>
           <w:tcPr>
-            <w:tcW w:type="dxa" w:w="1296"/>
-            <w:shd w:fill="DCEBFA"/>
+            <w:tcW w:type="dxa" w:w="2510"/>
+            <w:shd w:fill="FFF9E8"/>
+            <w:vAlign w:val="center"/>
+            <w:tcMar>
+              <w:top w:w="80" w:type="dxa"/>
+              <w:start w:w="120" w:type="dxa"/>
+              <w:bottom w:w="80" w:type="dxa"/>
+              <w:end w:w="120" w:type="dxa"/>
+            </w:tcMar>
           </w:tcPr>
           <w:p>
+            <w:pPr>
+              <w:spacing w:before="40" w:after="40" w:line="276" w:lineRule="auto"/>
+              <w:jc w:val="left"/>
+            </w:pPr>
+            <w:r/>
             <w:r>
               <w:rPr>
+                <w:rFonts w:ascii="Microsoft YaHei" w:hAnsi="Microsoft YaHei" w:eastAsia="Microsoft YaHei"/>
+                <w:b w:val="0"/>
+                <w:i w:val="0"/>
+                <w:color w:val="24364B"/>
+                <w:sz w:val="17"/>
+              </w:rPr>
+            </w:r>
+          </w:p>
+        </w:tc>
+      </w:tr>
+      <w:tr>
+        <w:trPr>
+          <w:cantSplit/>
+        </w:trPr>
+        <w:tc>
+          <w:tcPr>
+            <w:tcW w:type="dxa" w:w="1215"/>
+            <w:shd w:fill="EDF5FF"/>
+            <w:vAlign w:val="center"/>
+            <w:tcMar>
+              <w:top w:w="80" w:type="dxa"/>
+              <w:start w:w="120" w:type="dxa"/>
+              <w:bottom w:w="80" w:type="dxa"/>
+              <w:end w:w="120" w:type="dxa"/>
+            </w:tcMar>
+          </w:tcPr>
+          <w:p>
+            <w:pPr>
+              <w:spacing w:before="40" w:after="40" w:line="276" w:lineRule="auto"/>
+              <w:jc w:val="center"/>
+            </w:pPr>
+            <w:r/>
+            <w:r>
+              <w:rPr>
+                <w:rFonts w:ascii="Microsoft YaHei" w:hAnsi="Microsoft YaHei" w:eastAsia="Microsoft YaHei"/>
                 <w:b/>
+                <w:i w:val="0"/>
+                <w:color w:val="17365D"/>
+                <w:sz w:val="17"/>
               </w:rPr>
-              <w:t>评审结论</w:t>
+              <w:t>归档位置</w:t>
             </w:r>
           </w:p>
         </w:tc>
         <w:tc>
           <w:tcPr>
-            <w:tcW w:type="dxa" w:w="1296"/>
-            <w:shd w:fill="DCEBFA"/>
+            <w:tcW w:type="dxa" w:w="2510"/>
+            <w:shd w:fill="FFF9E8"/>
+            <w:vAlign w:val="center"/>
+            <w:tcMar>
+              <w:top w:w="80" w:type="dxa"/>
+              <w:start w:w="120" w:type="dxa"/>
+              <w:bottom w:w="80" w:type="dxa"/>
+              <w:end w:w="120" w:type="dxa"/>
+            </w:tcMar>
           </w:tcPr>
           <w:p>
+            <w:pPr>
+              <w:spacing w:before="40" w:after="40" w:line="276" w:lineRule="auto"/>
+              <w:jc w:val="left"/>
+            </w:pPr>
+            <w:r/>
             <w:r>
               <w:rPr>
+                <w:rFonts w:ascii="Microsoft YaHei" w:hAnsi="Microsoft YaHei" w:eastAsia="Microsoft YaHei"/>
+                <w:b w:val="0"/>
+                <w:i w:val="0"/>
+                <w:color w:val="24364B"/>
+                <w:sz w:val="17"/>
+              </w:rPr>
+            </w:r>
+          </w:p>
+        </w:tc>
+        <w:tc>
+          <w:tcPr>
+            <w:tcW w:type="dxa" w:w="1215"/>
+            <w:shd w:fill="EDF5FF"/>
+            <w:vAlign w:val="center"/>
+            <w:tcMar>
+              <w:top w:w="80" w:type="dxa"/>
+              <w:start w:w="120" w:type="dxa"/>
+              <w:bottom w:w="80" w:type="dxa"/>
+              <w:end w:w="120" w:type="dxa"/>
+            </w:tcMar>
+          </w:tcPr>
+          <w:p>
+            <w:pPr>
+              <w:spacing w:before="40" w:after="40" w:line="276" w:lineRule="auto"/>
+              <w:jc w:val="center"/>
+            </w:pPr>
+            <w:r/>
+            <w:r>
+              <w:rPr>
+                <w:rFonts w:ascii="Microsoft YaHei" w:hAnsi="Microsoft YaHei" w:eastAsia="Microsoft YaHei"/>
                 <w:b/>
+                <w:i w:val="0"/>
+                <w:color w:val="17365D"/>
+                <w:sz w:val="17"/>
               </w:rPr>
-              <w:t>备注</w:t>
+              <w:t>附件数量</w:t>
+            </w:r>
+          </w:p>
+        </w:tc>
+        <w:tc>
+          <w:tcPr>
+            <w:tcW w:type="dxa" w:w="2510"/>
+            <w:shd w:fill="FFF9E8"/>
+            <w:vAlign w:val="center"/>
+            <w:tcMar>
+              <w:top w:w="80" w:type="dxa"/>
+              <w:start w:w="120" w:type="dxa"/>
+              <w:bottom w:w="80" w:type="dxa"/>
+              <w:end w:w="120" w:type="dxa"/>
+            </w:tcMar>
+          </w:tcPr>
+          <w:p>
+            <w:pPr>
+              <w:spacing w:before="40" w:after="40" w:line="276" w:lineRule="auto"/>
+              <w:jc w:val="left"/>
+            </w:pPr>
+            <w:r/>
+            <w:r>
+              <w:rPr>
+                <w:rFonts w:ascii="Microsoft YaHei" w:hAnsi="Microsoft YaHei" w:eastAsia="Microsoft YaHei"/>
+                <w:b w:val="0"/>
+                <w:i w:val="0"/>
+                <w:color w:val="24364B"/>
+                <w:sz w:val="17"/>
+              </w:rPr>
+            </w:r>
+          </w:p>
+        </w:tc>
+        <w:tc>
+          <w:tcPr>
+            <w:tcW w:type="dxa" w:w="1215"/>
+            <w:shd w:fill="EDF5FF"/>
+            <w:vAlign w:val="center"/>
+            <w:tcMar>
+              <w:top w:w="80" w:type="dxa"/>
+              <w:start w:w="120" w:type="dxa"/>
+              <w:bottom w:w="80" w:type="dxa"/>
+              <w:end w:w="120" w:type="dxa"/>
+            </w:tcMar>
+          </w:tcPr>
+          <w:p>
+            <w:pPr>
+              <w:spacing w:before="40" w:after="40" w:line="276" w:lineRule="auto"/>
+              <w:jc w:val="center"/>
+            </w:pPr>
+            <w:r/>
+            <w:r>
+              <w:rPr>
+                <w:rFonts w:ascii="Microsoft YaHei" w:hAnsi="Microsoft YaHei" w:eastAsia="Microsoft YaHei"/>
+                <w:b/>
+                <w:i w:val="0"/>
+                <w:color w:val="17365D"/>
+                <w:sz w:val="17"/>
+              </w:rPr>
+              <w:t>复核人</w:t>
+            </w:r>
+          </w:p>
+        </w:tc>
+        <w:tc>
+          <w:tcPr>
+            <w:tcW w:type="dxa" w:w="2510"/>
+            <w:shd w:fill="FFF9E8"/>
+            <w:vAlign w:val="center"/>
+            <w:tcMar>
+              <w:top w:w="80" w:type="dxa"/>
+              <w:start w:w="120" w:type="dxa"/>
+              <w:bottom w:w="80" w:type="dxa"/>
+              <w:end w:w="120" w:type="dxa"/>
+            </w:tcMar>
+          </w:tcPr>
+          <w:p>
+            <w:pPr>
+              <w:spacing w:before="40" w:after="40" w:line="276" w:lineRule="auto"/>
+              <w:jc w:val="left"/>
+            </w:pPr>
+            <w:r/>
+            <w:r>
+              <w:rPr>
+                <w:rFonts w:ascii="Microsoft YaHei" w:hAnsi="Microsoft YaHei" w:eastAsia="Microsoft YaHei"/>
+                <w:b w:val="0"/>
+                <w:i w:val="0"/>
+                <w:color w:val="24364B"/>
+                <w:sz w:val="17"/>
+              </w:rPr>
+            </w:r>
+          </w:p>
+        </w:tc>
+        <w:tc>
+          <w:tcPr>
+            <w:tcW w:type="dxa" w:w="1215"/>
+            <w:shd w:fill="EDF5FF"/>
+            <w:vAlign w:val="center"/>
+            <w:tcMar>
+              <w:top w:w="80" w:type="dxa"/>
+              <w:start w:w="120" w:type="dxa"/>
+              <w:bottom w:w="80" w:type="dxa"/>
+              <w:end w:w="120" w:type="dxa"/>
+            </w:tcMar>
+          </w:tcPr>
+          <w:p>
+            <w:pPr>
+              <w:spacing w:before="40" w:after="40" w:line="276" w:lineRule="auto"/>
+              <w:jc w:val="center"/>
+            </w:pPr>
+            <w:r/>
+            <w:r>
+              <w:rPr>
+                <w:rFonts w:ascii="Microsoft YaHei" w:hAnsi="Microsoft YaHei" w:eastAsia="Microsoft YaHei"/>
+                <w:b/>
+                <w:i w:val="0"/>
+                <w:color w:val="17365D"/>
+                <w:sz w:val="17"/>
+              </w:rPr>
+              <w:t>复核日期</w:t>
+            </w:r>
+          </w:p>
+        </w:tc>
+        <w:tc>
+          <w:tcPr>
+            <w:tcW w:type="dxa" w:w="2510"/>
+            <w:shd w:fill="FFF9E8"/>
+            <w:vAlign w:val="center"/>
+            <w:tcMar>
+              <w:top w:w="80" w:type="dxa"/>
+              <w:start w:w="120" w:type="dxa"/>
+              <w:bottom w:w="80" w:type="dxa"/>
+              <w:end w:w="120" w:type="dxa"/>
+            </w:tcMar>
+          </w:tcPr>
+          <w:p>
+            <w:pPr>
+              <w:spacing w:before="40" w:after="40" w:line="276" w:lineRule="auto"/>
+              <w:jc w:val="left"/>
+            </w:pPr>
+            <w:r/>
+            <w:r>
+              <w:rPr>
+                <w:rFonts w:ascii="Microsoft YaHei" w:hAnsi="Microsoft YaHei" w:eastAsia="Microsoft YaHei"/>
+                <w:b w:val="0"/>
+                <w:i w:val="0"/>
+                <w:color w:val="24364B"/>
+                <w:sz w:val="17"/>
+              </w:rPr>
+            </w:r>
+          </w:p>
+        </w:tc>
+      </w:tr>
+    </w:tbl>
+    <w:p>
+      <w:pPr>
+        <w:pStyle w:val="Heading2"/>
+        <w:keepNext/>
+      </w:pPr>
+      <w:r>
+        <w:rPr>
+          <w:rFonts w:ascii="Microsoft YaHei" w:hAnsi="Microsoft YaHei" w:eastAsia="Microsoft YaHei"/>
+          <w:b/>
+          <w:i w:val="0"/>
+          <w:color w:val="1769E0"/>
+          <w:sz w:val="26"/>
+        </w:rPr>
+        <w:t>二、评审时序图</w:t>
+      </w:r>
+    </w:p>
+    <w:tbl>
+      <w:tblPr>
+        <w:tblStyle w:val="TableGrid"/>
+        <w:tblW w:type="dxa" w:w="14900"/>
+        <w:jc w:val="left"/>
+        <w:tblLayout w:type="fixed"/>
+        <w:tblLook w:firstColumn="1" w:firstRow="1" w:lastColumn="0" w:lastRow="0" w:noHBand="0" w:noVBand="1" w:val="04A0"/>
+        <w:tblInd w:w="120" w:type="dxa"/>
+        <w:tblBorders>
+          <w:top w:val="single" w:sz="5" w:color="A8C3DF"/>
+          <w:left w:val="single" w:sz="5" w:color="A8C3DF"/>
+          <w:bottom w:val="single" w:sz="5" w:color="A8C3DF"/>
+          <w:right w:val="single" w:sz="5" w:color="A8C3DF"/>
+          <w:insideH w:val="single" w:sz="5" w:color="A8C3DF"/>
+          <w:insideV w:val="single" w:sz="5" w:color="A8C3DF"/>
+        </w:tblBorders>
+      </w:tblPr>
+      <w:tblGrid>
+        <w:gridCol w:w="14900"/>
+      </w:tblGrid>
+      <w:tr>
+        <w:trPr>
+          <w:cantSplit/>
+        </w:trPr>
+        <w:tc>
+          <w:tcPr>
+            <w:tcW w:type="dxa" w:w="14900"/>
+            <w:shd w:fill="F6F9FD"/>
+          </w:tcPr>
+          <w:p>
+            <w:pPr>
+              <w:spacing w:before="440" w:after="440"/>
+              <w:jc w:val="center"/>
+            </w:pPr>
+            <w:r/>
+            <w:r>
+              <w:rPr>
+                <w:rFonts w:ascii="Microsoft YaHei" w:hAnsi="Microsoft YaHei" w:eastAsia="Microsoft YaHei"/>
+                <w:b w:val="0"/>
+                <w:i/>
+                <w:color w:val="667A90"/>
+                <w:sz w:val="20"/>
+              </w:rPr>
+              <w:t>在此粘贴已编号的时序图，或填写附件名称与归档链接</w:t>
+            </w:r>
+          </w:p>
+        </w:tc>
+      </w:tr>
+    </w:tbl>
+    <w:p>
+      <w:pPr>
+        <w:pStyle w:val="Heading2"/>
+        <w:keepNext/>
+      </w:pPr>
+      <w:r>
+        <w:rPr>
+          <w:rFonts w:ascii="Microsoft YaHei" w:hAnsi="Microsoft YaHei" w:eastAsia="Microsoft YaHei"/>
+          <w:b/>
+          <w:i w:val="0"/>
+          <w:color w:val="1769E0"/>
+          <w:sz w:val="26"/>
+        </w:rPr>
+        <w:t>三、明细记录</w:t>
+      </w:r>
+    </w:p>
+    <w:tbl>
+      <w:tblPr>
+        <w:tblStyle w:val="TableGrid"/>
+        <w:tblW w:type="dxa" w:w="14900"/>
+        <w:tblLayout w:type="fixed"/>
+        <w:tblLook w:firstColumn="1" w:firstRow="1" w:lastColumn="0" w:lastRow="0" w:noHBand="0" w:noVBand="1" w:val="04A0"/>
+        <w:jc w:val="left"/>
+        <w:tblInd w:w="120" w:type="dxa"/>
+        <w:tblBorders>
+          <w:top w:val="single" w:sz="5" w:color="C8D8EA"/>
+          <w:left w:val="single" w:sz="5" w:color="C8D8EA"/>
+          <w:bottom w:val="single" w:sz="5" w:color="C8D8EA"/>
+          <w:right w:val="single" w:sz="5" w:color="C8D8EA"/>
+          <w:insideH w:val="single" w:sz="5" w:color="C8D8EA"/>
+          <w:insideV w:val="single" w:sz="5" w:color="C8D8EA"/>
+        </w:tblBorders>
+      </w:tblPr>
+      <w:tblGrid>
+        <w:gridCol w:w="898"/>
+        <w:gridCol w:w="2872"/>
+        <w:gridCol w:w="2423"/>
+        <w:gridCol w:w="3949"/>
+        <w:gridCol w:w="1526"/>
+        <w:gridCol w:w="1705"/>
+        <w:gridCol w:w="1527"/>
+      </w:tblGrid>
+      <w:tr>
+        <w:trPr>
+          <w:cantSplit/>
+          <w:tblHeader w:val="true"/>
+          <w:cantSplit/>
+          <w:cantSplit/>
+          <w:cantSplit/>
+          <w:cantSplit/>
+          <w:cantSplit/>
+          <w:cantSplit/>
+        </w:trPr>
+        <w:tc>
+          <w:tcPr>
+            <w:tcW w:type="dxa" w:w="898"/>
+            <w:shd w:fill="1769E0"/>
+            <w:vAlign w:val="center"/>
+            <w:tcMar>
+              <w:top w:w="80" w:type="dxa"/>
+              <w:start w:w="120" w:type="dxa"/>
+              <w:bottom w:w="80" w:type="dxa"/>
+              <w:end w:w="120" w:type="dxa"/>
+            </w:tcMar>
+          </w:tcPr>
+          <w:p>
+            <w:pPr>
+              <w:spacing w:before="40" w:after="40" w:line="276" w:lineRule="auto"/>
+              <w:jc w:val="center"/>
+            </w:pPr>
+            <w:r/>
+            <w:r>
+              <w:rPr>
+                <w:rFonts w:ascii="Microsoft YaHei" w:hAnsi="Microsoft YaHei" w:eastAsia="Microsoft YaHei"/>
+                <w:b/>
+                <w:i w:val="0"/>
+                <w:color w:val="FFFFFF"/>
+                <w:sz w:val="17"/>
+              </w:rPr>
+              <w:t>序号</w:t>
+            </w:r>
+          </w:p>
+        </w:tc>
+        <w:tc>
+          <w:tcPr>
+            <w:tcW w:type="dxa" w:w="2872"/>
+            <w:shd w:fill="17365D"/>
+            <w:vAlign w:val="center"/>
+            <w:tcMar>
+              <w:top w:w="80" w:type="dxa"/>
+              <w:start w:w="120" w:type="dxa"/>
+              <w:bottom w:w="80" w:type="dxa"/>
+              <w:end w:w="120" w:type="dxa"/>
+            </w:tcMar>
+          </w:tcPr>
+          <w:p>
+            <w:pPr>
+              <w:spacing w:before="40" w:after="40" w:line="276" w:lineRule="auto"/>
+              <w:jc w:val="center"/>
+            </w:pPr>
+            <w:r/>
+            <w:r>
+              <w:rPr>
+                <w:rFonts w:ascii="Microsoft YaHei" w:hAnsi="Microsoft YaHei" w:eastAsia="Microsoft YaHei"/>
+                <w:b/>
+                <w:i w:val="0"/>
+                <w:color w:val="FFFFFF"/>
+                <w:sz w:val="17"/>
+              </w:rPr>
+              <w:t>评审要点</w:t>
+            </w:r>
+          </w:p>
+        </w:tc>
+        <w:tc>
+          <w:tcPr>
+            <w:tcW w:type="dxa" w:w="2423"/>
+            <w:shd w:fill="17365D"/>
+            <w:vAlign w:val="center"/>
+            <w:tcMar>
+              <w:top w:w="80" w:type="dxa"/>
+              <w:start w:w="120" w:type="dxa"/>
+              <w:bottom w:w="80" w:type="dxa"/>
+              <w:end w:w="120" w:type="dxa"/>
+            </w:tcMar>
+          </w:tcPr>
+          <w:p>
+            <w:pPr>
+              <w:spacing w:before="40" w:after="40" w:line="276" w:lineRule="auto"/>
+              <w:jc w:val="center"/>
+            </w:pPr>
+            <w:r/>
+            <w:r>
+              <w:rPr>
+                <w:rFonts w:ascii="Microsoft YaHei" w:hAnsi="Microsoft YaHei" w:eastAsia="Microsoft YaHei"/>
+                <w:b/>
+                <w:i w:val="0"/>
+                <w:color w:val="FFFFFF"/>
+                <w:sz w:val="17"/>
+              </w:rPr>
+              <w:t>涉及系统/角色</w:t>
+            </w:r>
+          </w:p>
+        </w:tc>
+        <w:tc>
+          <w:tcPr>
+            <w:tcW w:type="dxa" w:w="3949"/>
+            <w:shd w:fill="17365D"/>
+            <w:vAlign w:val="center"/>
+            <w:tcMar>
+              <w:top w:w="80" w:type="dxa"/>
+              <w:start w:w="120" w:type="dxa"/>
+              <w:bottom w:w="80" w:type="dxa"/>
+              <w:end w:w="120" w:type="dxa"/>
+            </w:tcMar>
+          </w:tcPr>
+          <w:p>
+            <w:pPr>
+              <w:spacing w:before="40" w:after="40" w:line="276" w:lineRule="auto"/>
+              <w:jc w:val="center"/>
+            </w:pPr>
+            <w:r/>
+            <w:r>
+              <w:rPr>
+                <w:rFonts w:ascii="Microsoft YaHei" w:hAnsi="Microsoft YaHei" w:eastAsia="Microsoft YaHei"/>
+                <w:b/>
+                <w:i w:val="0"/>
+                <w:color w:val="FFFFFF"/>
+                <w:sz w:val="17"/>
+              </w:rPr>
+              <w:t>评审意见</w:t>
+            </w:r>
+          </w:p>
+        </w:tc>
+        <w:tc>
+          <w:tcPr>
+            <w:tcW w:type="dxa" w:w="1526"/>
+            <w:shd w:fill="17365D"/>
+            <w:vAlign w:val="center"/>
+            <w:tcMar>
+              <w:top w:w="80" w:type="dxa"/>
+              <w:start w:w="120" w:type="dxa"/>
+              <w:bottom w:w="80" w:type="dxa"/>
+              <w:end w:w="120" w:type="dxa"/>
+            </w:tcMar>
+          </w:tcPr>
+          <w:p>
+            <w:pPr>
+              <w:spacing w:before="40" w:after="40" w:line="276" w:lineRule="auto"/>
+              <w:jc w:val="center"/>
+            </w:pPr>
+            <w:r/>
+            <w:r>
+              <w:rPr>
+                <w:rFonts w:ascii="Microsoft YaHei" w:hAnsi="Microsoft YaHei" w:eastAsia="Microsoft YaHei"/>
+                <w:b/>
+                <w:i w:val="0"/>
+                <w:color w:val="FFFFFF"/>
+                <w:sz w:val="17"/>
+              </w:rPr>
+              <w:t>责任人</w:t>
+            </w:r>
+          </w:p>
+        </w:tc>
+        <w:tc>
+          <w:tcPr>
+            <w:tcW w:type="dxa" w:w="1705"/>
+            <w:shd w:fill="17365D"/>
+            <w:vAlign w:val="center"/>
+            <w:tcMar>
+              <w:top w:w="80" w:type="dxa"/>
+              <w:start w:w="120" w:type="dxa"/>
+              <w:bottom w:w="80" w:type="dxa"/>
+              <w:end w:w="120" w:type="dxa"/>
+            </w:tcMar>
+          </w:tcPr>
+          <w:p>
+            <w:pPr>
+              <w:spacing w:before="40" w:after="40" w:line="276" w:lineRule="auto"/>
+              <w:jc w:val="center"/>
+            </w:pPr>
+            <w:r/>
+            <w:r>
+              <w:rPr>
+                <w:rFonts w:ascii="Microsoft YaHei" w:hAnsi="Microsoft YaHei" w:eastAsia="Microsoft YaHei"/>
+                <w:b/>
+                <w:i w:val="0"/>
+                <w:color w:val="FFFFFF"/>
+                <w:sz w:val="17"/>
+              </w:rPr>
+              <w:t>计划完成</w:t>
+            </w:r>
+          </w:p>
+        </w:tc>
+        <w:tc>
+          <w:tcPr>
+            <w:tcW w:type="dxa" w:w="1527"/>
+            <w:shd w:fill="17365D"/>
+            <w:vAlign w:val="center"/>
+            <w:tcMar>
+              <w:top w:w="80" w:type="dxa"/>
+              <w:start w:w="120" w:type="dxa"/>
+              <w:bottom w:w="80" w:type="dxa"/>
+              <w:end w:w="120" w:type="dxa"/>
+            </w:tcMar>
+          </w:tcPr>
+          <w:p>
+            <w:pPr>
+              <w:spacing w:before="40" w:after="40" w:line="276" w:lineRule="auto"/>
+              <w:jc w:val="center"/>
+            </w:pPr>
+            <w:r/>
+            <w:r>
+              <w:rPr>
+                <w:rFonts w:ascii="Microsoft YaHei" w:hAnsi="Microsoft YaHei" w:eastAsia="Microsoft YaHei"/>
+                <w:b/>
+                <w:i w:val="0"/>
+                <w:color w:val="FFFFFF"/>
+                <w:sz w:val="17"/>
+              </w:rPr>
+              <w:t>状态</w:t>
             </w:r>
           </w:p>
         </w:tc>
       </w:tr>
       <w:tr>
+        <w:trPr>
+          <w:cantSplit/>
+          <w:cantSplit/>
+          <w:cantSplit/>
+          <w:cantSplit/>
+          <w:cantSplit/>
+          <w:cantSplit/>
+          <w:cantSplit/>
+        </w:trPr>
         <w:tc>
           <w:tcPr>
-            <w:tcW w:type="dxa" w:w="1296"/>
+            <w:tcW w:type="dxa" w:w="898"/>
+            <w:shd w:fill="FFFFFF"/>
+            <w:vAlign w:val="center"/>
+            <w:tcMar>
+              <w:top w:w="80" w:type="dxa"/>
+              <w:start w:w="120" w:type="dxa"/>
+              <w:bottom w:w="80" w:type="dxa"/>
+              <w:end w:w="120" w:type="dxa"/>
+            </w:tcMar>
           </w:tcPr>
           <w:p>
+            <w:pPr>
+              <w:spacing w:before="40" w:after="40" w:line="276" w:lineRule="auto"/>
+              <w:jc w:val="center"/>
+            </w:pPr>
             <w:r/>
+            <w:r>
+              <w:rPr>
+                <w:rFonts w:ascii="Microsoft YaHei" w:hAnsi="Microsoft YaHei" w:eastAsia="Microsoft YaHei"/>
+                <w:b w:val="0"/>
+                <w:i w:val="0"/>
+                <w:color w:val="667A90"/>
+                <w:sz w:val="17"/>
+              </w:rPr>
+              <w:t>1</w:t>
+            </w:r>
           </w:p>
         </w:tc>
         <w:tc>
           <w:tcPr>
-            <w:tcW w:type="dxa" w:w="1296"/>
+            <w:tcW w:type="dxa" w:w="2872"/>
+            <w:shd w:fill="FFF9E8"/>
+            <w:vAlign w:val="center"/>
+            <w:tcMar>
+              <w:top w:w="80" w:type="dxa"/>
+              <w:start w:w="120" w:type="dxa"/>
+              <w:bottom w:w="80" w:type="dxa"/>
+              <w:end w:w="120" w:type="dxa"/>
+            </w:tcMar>
           </w:tcPr>
           <w:p>
+            <w:pPr>
+              <w:spacing w:before="40" w:after="40" w:line="276" w:lineRule="auto"/>
+              <w:jc w:val="left"/>
+            </w:pPr>
             <w:r/>
+            <w:r>
+              <w:rPr>
+                <w:rFonts w:ascii="Microsoft YaHei" w:hAnsi="Microsoft YaHei" w:eastAsia="Microsoft YaHei"/>
+                <w:b w:val="0"/>
+                <w:i w:val="0"/>
+                <w:color w:val="24364B"/>
+                <w:sz w:val="17"/>
+              </w:rPr>
+            </w:r>
           </w:p>
         </w:tc>
         <w:tc>
           <w:tcPr>
-            <w:tcW w:type="dxa" w:w="1296"/>
+            <w:tcW w:type="dxa" w:w="2423"/>
+            <w:shd w:fill="FFF9E8"/>
+            <w:vAlign w:val="center"/>
+            <w:tcMar>
+              <w:top w:w="80" w:type="dxa"/>
+              <w:start w:w="120" w:type="dxa"/>
+              <w:bottom w:w="80" w:type="dxa"/>
+              <w:end w:w="120" w:type="dxa"/>
+            </w:tcMar>
           </w:tcPr>
           <w:p>
+            <w:pPr>
+              <w:spacing w:before="40" w:after="40" w:line="276" w:lineRule="auto"/>
+              <w:jc w:val="left"/>
+            </w:pPr>
             <w:r/>
+            <w:r>
+              <w:rPr>
+                <w:rFonts w:ascii="Microsoft YaHei" w:hAnsi="Microsoft YaHei" w:eastAsia="Microsoft YaHei"/>
+                <w:b w:val="0"/>
+                <w:i w:val="0"/>
+                <w:color w:val="24364B"/>
+                <w:sz w:val="17"/>
+              </w:rPr>
+            </w:r>
           </w:p>
         </w:tc>
         <w:tc>
           <w:tcPr>
-            <w:tcW w:type="dxa" w:w="1296"/>
+            <w:tcW w:type="dxa" w:w="3949"/>
+            <w:shd w:fill="FFF9E8"/>
+            <w:vAlign w:val="center"/>
+            <w:tcMar>
+              <w:top w:w="80" w:type="dxa"/>
+              <w:start w:w="120" w:type="dxa"/>
+              <w:bottom w:w="80" w:type="dxa"/>
+              <w:end w:w="120" w:type="dxa"/>
+            </w:tcMar>
           </w:tcPr>
           <w:p>
+            <w:pPr>
+              <w:spacing w:before="40" w:after="40" w:line="276" w:lineRule="auto"/>
+              <w:jc w:val="left"/>
+            </w:pPr>
             <w:r/>
+            <w:r>
+              <w:rPr>
+                <w:rFonts w:ascii="Microsoft YaHei" w:hAnsi="Microsoft YaHei" w:eastAsia="Microsoft YaHei"/>
+                <w:b w:val="0"/>
+                <w:i w:val="0"/>
+                <w:color w:val="24364B"/>
+                <w:sz w:val="17"/>
+              </w:rPr>
+            </w:r>
           </w:p>
         </w:tc>
         <w:tc>
           <w:tcPr>
-            <w:tcW w:type="dxa" w:w="1296"/>
+            <w:tcW w:type="dxa" w:w="1526"/>
+            <w:shd w:fill="FFF9E8"/>
+            <w:vAlign w:val="center"/>
+            <w:tcMar>
+              <w:top w:w="80" w:type="dxa"/>
+              <w:start w:w="120" w:type="dxa"/>
+              <w:bottom w:w="80" w:type="dxa"/>
+              <w:end w:w="120" w:type="dxa"/>
+            </w:tcMar>
           </w:tcPr>
           <w:p>
+            <w:pPr>
+              <w:spacing w:before="40" w:after="40" w:line="276" w:lineRule="auto"/>
+              <w:jc w:val="left"/>
+            </w:pPr>
             <w:r/>
+            <w:r>
+              <w:rPr>
+                <w:rFonts w:ascii="Microsoft YaHei" w:hAnsi="Microsoft YaHei" w:eastAsia="Microsoft YaHei"/>
+                <w:b w:val="0"/>
+                <w:i w:val="0"/>
+                <w:color w:val="24364B"/>
+                <w:sz w:val="17"/>
+              </w:rPr>
+            </w:r>
           </w:p>
         </w:tc>
         <w:tc>
           <w:tcPr>
-            <w:tcW w:type="dxa" w:w="1296"/>
+            <w:tcW w:type="dxa" w:w="1705"/>
+            <w:shd w:fill="FFF9E8"/>
+            <w:vAlign w:val="center"/>
+            <w:tcMar>
+              <w:top w:w="80" w:type="dxa"/>
+              <w:start w:w="120" w:type="dxa"/>
+              <w:bottom w:w="80" w:type="dxa"/>
+              <w:end w:w="120" w:type="dxa"/>
+            </w:tcMar>
           </w:tcPr>
           <w:p>
+            <w:pPr>
+              <w:spacing w:before="40" w:after="40" w:line="276" w:lineRule="auto"/>
+              <w:jc w:val="left"/>
+            </w:pPr>
             <w:r/>
+            <w:r>
+              <w:rPr>
+                <w:rFonts w:ascii="Microsoft YaHei" w:hAnsi="Microsoft YaHei" w:eastAsia="Microsoft YaHei"/>
+                <w:b w:val="0"/>
+                <w:i w:val="0"/>
+                <w:color w:val="24364B"/>
+                <w:sz w:val="17"/>
+              </w:rPr>
+            </w:r>
           </w:p>
         </w:tc>
         <w:tc>
           <w:tcPr>
-            <w:tcW w:type="dxa" w:w="1296"/>
+            <w:tcW w:type="dxa" w:w="1527"/>
+            <w:shd w:fill="FFF9E8"/>
+            <w:vAlign w:val="center"/>
+            <w:tcMar>
+              <w:top w:w="80" w:type="dxa"/>
+              <w:start w:w="120" w:type="dxa"/>
+              <w:bottom w:w="80" w:type="dxa"/>
+              <w:end w:w="120" w:type="dxa"/>
+            </w:tcMar>
           </w:tcPr>
           <w:p>
+            <w:pPr>
+              <w:spacing w:before="40" w:after="40" w:line="276" w:lineRule="auto"/>
+              <w:jc w:val="left"/>
+            </w:pPr>
             <w:r/>
+            <w:r>
+              <w:rPr>
+                <w:rFonts w:ascii="Microsoft YaHei" w:hAnsi="Microsoft YaHei" w:eastAsia="Microsoft YaHei"/>
+                <w:b w:val="0"/>
+                <w:i w:val="0"/>
+                <w:color w:val="24364B"/>
+                <w:sz w:val="17"/>
+              </w:rPr>
+            </w:r>
+          </w:p>
+        </w:tc>
+      </w:tr>
+      <w:tr>
+        <w:trPr>
+          <w:cantSplit/>
+          <w:cantSplit/>
+          <w:cantSplit/>
+          <w:cantSplit/>
+          <w:cantSplit/>
+          <w:cantSplit/>
+        </w:trPr>
+        <w:tc>
+          <w:tcPr>
+            <w:tcW w:type="dxa" w:w="898"/>
+            <w:shd w:fill="FFFFFF"/>
+            <w:vAlign w:val="center"/>
+            <w:tcMar>
+              <w:top w:w="80" w:type="dxa"/>
+              <w:start w:w="120" w:type="dxa"/>
+              <w:bottom w:w="80" w:type="dxa"/>
+              <w:end w:w="120" w:type="dxa"/>
+            </w:tcMar>
+          </w:tcPr>
+          <w:p>
+            <w:pPr>
+              <w:spacing w:before="40" w:after="40" w:line="276" w:lineRule="auto"/>
+              <w:jc w:val="center"/>
+            </w:pPr>
+            <w:r/>
+            <w:r>
+              <w:rPr>
+                <w:rFonts w:ascii="Microsoft YaHei" w:hAnsi="Microsoft YaHei" w:eastAsia="Microsoft YaHei"/>
+                <w:b w:val="0"/>
+                <w:i w:val="0"/>
+                <w:color w:val="667A90"/>
+                <w:sz w:val="17"/>
+              </w:rPr>
+              <w:t>2</w:t>
+            </w:r>
           </w:p>
         </w:tc>
         <w:tc>
           <w:tcPr>
-            <w:tcW w:type="dxa" w:w="1296"/>
+            <w:tcW w:type="dxa" w:w="2872"/>
+            <w:shd w:fill="FFF9E8"/>
+            <w:vAlign w:val="center"/>
+            <w:tcMar>
+              <w:top w:w="80" w:type="dxa"/>
+              <w:start w:w="120" w:type="dxa"/>
+              <w:bottom w:w="80" w:type="dxa"/>
+              <w:end w:w="120" w:type="dxa"/>
+            </w:tcMar>
           </w:tcPr>
           <w:p>
+            <w:pPr>
+              <w:spacing w:before="40" w:after="40" w:line="276" w:lineRule="auto"/>
+              <w:jc w:val="left"/>
+            </w:pPr>
             <w:r/>
+            <w:r>
+              <w:rPr>
+                <w:rFonts w:ascii="Microsoft YaHei" w:hAnsi="Microsoft YaHei" w:eastAsia="Microsoft YaHei"/>
+                <w:b w:val="0"/>
+                <w:i w:val="0"/>
+                <w:color w:val="24364B"/>
+                <w:sz w:val="17"/>
+              </w:rPr>
+            </w:r>
+          </w:p>
+        </w:tc>
+        <w:tc>
+          <w:tcPr>
+            <w:tcW w:type="dxa" w:w="2423"/>
+            <w:shd w:fill="FFF9E8"/>
+            <w:vAlign w:val="center"/>
+            <w:tcMar>
+              <w:top w:w="80" w:type="dxa"/>
+              <w:start w:w="120" w:type="dxa"/>
+              <w:bottom w:w="80" w:type="dxa"/>
+              <w:end w:w="120" w:type="dxa"/>
+            </w:tcMar>
+          </w:tcPr>
+          <w:p>
+            <w:pPr>
+              <w:spacing w:before="40" w:after="40" w:line="276" w:lineRule="auto"/>
+              <w:jc w:val="left"/>
+            </w:pPr>
+            <w:r/>
+            <w:r>
+              <w:rPr>
+                <w:rFonts w:ascii="Microsoft YaHei" w:hAnsi="Microsoft YaHei" w:eastAsia="Microsoft YaHei"/>
+                <w:b w:val="0"/>
+                <w:i w:val="0"/>
+                <w:color w:val="24364B"/>
+                <w:sz w:val="17"/>
+              </w:rPr>
+            </w:r>
+          </w:p>
+        </w:tc>
+        <w:tc>
+          <w:tcPr>
+            <w:tcW w:type="dxa" w:w="3949"/>
+            <w:shd w:fill="FFF9E8"/>
+            <w:vAlign w:val="center"/>
+            <w:tcMar>
+              <w:top w:w="80" w:type="dxa"/>
+              <w:start w:w="120" w:type="dxa"/>
+              <w:bottom w:w="80" w:type="dxa"/>
+              <w:end w:w="120" w:type="dxa"/>
+            </w:tcMar>
+          </w:tcPr>
+          <w:p>
+            <w:pPr>
+              <w:spacing w:before="40" w:after="40" w:line="276" w:lineRule="auto"/>
+              <w:jc w:val="left"/>
+            </w:pPr>
+            <w:r/>
+            <w:r>
+              <w:rPr>
+                <w:rFonts w:ascii="Microsoft YaHei" w:hAnsi="Microsoft YaHei" w:eastAsia="Microsoft YaHei"/>
+                <w:b w:val="0"/>
+                <w:i w:val="0"/>
+                <w:color w:val="24364B"/>
+                <w:sz w:val="17"/>
+              </w:rPr>
+            </w:r>
+          </w:p>
+        </w:tc>
+        <w:tc>
+          <w:tcPr>
+            <w:tcW w:type="dxa" w:w="1526"/>
+            <w:shd w:fill="FFF9E8"/>
+            <w:vAlign w:val="center"/>
+            <w:tcMar>
+              <w:top w:w="80" w:type="dxa"/>
+              <w:start w:w="120" w:type="dxa"/>
+              <w:bottom w:w="80" w:type="dxa"/>
+              <w:end w:w="120" w:type="dxa"/>
+            </w:tcMar>
+          </w:tcPr>
+          <w:p>
+            <w:pPr>
+              <w:spacing w:before="40" w:after="40" w:line="276" w:lineRule="auto"/>
+              <w:jc w:val="left"/>
+            </w:pPr>
+            <w:r/>
+            <w:r>
+              <w:rPr>
+                <w:rFonts w:ascii="Microsoft YaHei" w:hAnsi="Microsoft YaHei" w:eastAsia="Microsoft YaHei"/>
+                <w:b w:val="0"/>
+                <w:i w:val="0"/>
+                <w:color w:val="24364B"/>
+                <w:sz w:val="17"/>
+              </w:rPr>
+            </w:r>
+          </w:p>
+        </w:tc>
+        <w:tc>
+          <w:tcPr>
+            <w:tcW w:type="dxa" w:w="1705"/>
+            <w:shd w:fill="FFF9E8"/>
+            <w:vAlign w:val="center"/>
+            <w:tcMar>
+              <w:top w:w="80" w:type="dxa"/>
+              <w:start w:w="120" w:type="dxa"/>
+              <w:bottom w:w="80" w:type="dxa"/>
+              <w:end w:w="120" w:type="dxa"/>
+            </w:tcMar>
+          </w:tcPr>
+          <w:p>
+            <w:pPr>
+              <w:spacing w:before="40" w:after="40" w:line="276" w:lineRule="auto"/>
+              <w:jc w:val="left"/>
+            </w:pPr>
+            <w:r/>
+            <w:r>
+              <w:rPr>
+                <w:rFonts w:ascii="Microsoft YaHei" w:hAnsi="Microsoft YaHei" w:eastAsia="Microsoft YaHei"/>
+                <w:b w:val="0"/>
+                <w:i w:val="0"/>
+                <w:color w:val="24364B"/>
+                <w:sz w:val="17"/>
+              </w:rPr>
+            </w:r>
+          </w:p>
+        </w:tc>
+        <w:tc>
+          <w:tcPr>
+            <w:tcW w:type="dxa" w:w="1527"/>
+            <w:shd w:fill="FFF9E8"/>
+            <w:vAlign w:val="center"/>
+            <w:tcMar>
+              <w:top w:w="80" w:type="dxa"/>
+              <w:start w:w="120" w:type="dxa"/>
+              <w:bottom w:w="80" w:type="dxa"/>
+              <w:end w:w="120" w:type="dxa"/>
+            </w:tcMar>
+          </w:tcPr>
+          <w:p>
+            <w:pPr>
+              <w:spacing w:before="40" w:after="40" w:line="276" w:lineRule="auto"/>
+              <w:jc w:val="left"/>
+            </w:pPr>
+            <w:r/>
+            <w:r>
+              <w:rPr>
+                <w:rFonts w:ascii="Microsoft YaHei" w:hAnsi="Microsoft YaHei" w:eastAsia="Microsoft YaHei"/>
+                <w:b w:val="0"/>
+                <w:i w:val="0"/>
+                <w:color w:val="24364B"/>
+                <w:sz w:val="17"/>
+              </w:rPr>
+            </w:r>
           </w:p>
         </w:tc>
       </w:tr>
       <w:tr>
+        <w:trPr>
+          <w:cantSplit/>
+          <w:cantSplit/>
+          <w:cantSplit/>
+          <w:cantSplit/>
+          <w:cantSplit/>
+        </w:trPr>
         <w:tc>
           <w:tcPr>
-            <w:tcW w:type="dxa" w:w="1296"/>
+            <w:tcW w:type="dxa" w:w="898"/>
+            <w:shd w:fill="FFFFFF"/>
+            <w:vAlign w:val="center"/>
+            <w:tcMar>
+              <w:top w:w="80" w:type="dxa"/>
+              <w:start w:w="120" w:type="dxa"/>
+              <w:bottom w:w="80" w:type="dxa"/>
+              <w:end w:w="120" w:type="dxa"/>
+            </w:tcMar>
           </w:tcPr>
           <w:p>
+            <w:pPr>
+              <w:spacing w:before="40" w:after="40" w:line="276" w:lineRule="auto"/>
+              <w:jc w:val="center"/>
+            </w:pPr>
             <w:r/>
+            <w:r>
+              <w:rPr>
+                <w:rFonts w:ascii="Microsoft YaHei" w:hAnsi="Microsoft YaHei" w:eastAsia="Microsoft YaHei"/>
+                <w:b w:val="0"/>
+                <w:i w:val="0"/>
+                <w:color w:val="667A90"/>
+                <w:sz w:val="17"/>
+              </w:rPr>
+              <w:t>3</w:t>
+            </w:r>
           </w:p>
         </w:tc>
         <w:tc>
           <w:tcPr>
-            <w:tcW w:type="dxa" w:w="1296"/>
+            <w:tcW w:type="dxa" w:w="2872"/>
+            <w:shd w:fill="FFF9E8"/>
+            <w:vAlign w:val="center"/>
+            <w:tcMar>
+              <w:top w:w="80" w:type="dxa"/>
+              <w:start w:w="120" w:type="dxa"/>
+              <w:bottom w:w="80" w:type="dxa"/>
+              <w:end w:w="120" w:type="dxa"/>
+            </w:tcMar>
           </w:tcPr>
           <w:p>
+            <w:pPr>
+              <w:spacing w:before="40" w:after="40" w:line="276" w:lineRule="auto"/>
+              <w:jc w:val="left"/>
+            </w:pPr>
             <w:r/>
+            <w:r>
+              <w:rPr>
+                <w:rFonts w:ascii="Microsoft YaHei" w:hAnsi="Microsoft YaHei" w:eastAsia="Microsoft YaHei"/>
+                <w:b w:val="0"/>
+                <w:i w:val="0"/>
+                <w:color w:val="24364B"/>
+                <w:sz w:val="17"/>
+              </w:rPr>
+            </w:r>
           </w:p>
         </w:tc>
         <w:tc>
           <w:tcPr>
-            <w:tcW w:type="dxa" w:w="1296"/>
+            <w:tcW w:type="dxa" w:w="2423"/>
+            <w:shd w:fill="FFF9E8"/>
+            <w:vAlign w:val="center"/>
+            <w:tcMar>
+              <w:top w:w="80" w:type="dxa"/>
+              <w:start w:w="120" w:type="dxa"/>
+              <w:bottom w:w="80" w:type="dxa"/>
+              <w:end w:w="120" w:type="dxa"/>
+            </w:tcMar>
           </w:tcPr>
           <w:p>
+            <w:pPr>
+              <w:spacing w:before="40" w:after="40" w:line="276" w:lineRule="auto"/>
+              <w:jc w:val="left"/>
+            </w:pPr>
             <w:r/>
+            <w:r>
+              <w:rPr>
+                <w:rFonts w:ascii="Microsoft YaHei" w:hAnsi="Microsoft YaHei" w:eastAsia="Microsoft YaHei"/>
+                <w:b w:val="0"/>
+                <w:i w:val="0"/>
+                <w:color w:val="24364B"/>
+                <w:sz w:val="17"/>
+              </w:rPr>
+            </w:r>
           </w:p>
         </w:tc>
         <w:tc>
           <w:tcPr>
-            <w:tcW w:type="dxa" w:w="1296"/>
+            <w:tcW w:type="dxa" w:w="3949"/>
+            <w:shd w:fill="FFF9E8"/>
+            <w:vAlign w:val="center"/>
+            <w:tcMar>
+              <w:top w:w="80" w:type="dxa"/>
+              <w:start w:w="120" w:type="dxa"/>
+              <w:bottom w:w="80" w:type="dxa"/>
+              <w:end w:w="120" w:type="dxa"/>
+            </w:tcMar>
           </w:tcPr>
           <w:p>
+            <w:pPr>
+              <w:spacing w:before="40" w:after="40" w:line="276" w:lineRule="auto"/>
+              <w:jc w:val="left"/>
+            </w:pPr>
             <w:r/>
+            <w:r>
+              <w:rPr>
+                <w:rFonts w:ascii="Microsoft YaHei" w:hAnsi="Microsoft YaHei" w:eastAsia="Microsoft YaHei"/>
+                <w:b w:val="0"/>
+                <w:i w:val="0"/>
+                <w:color w:val="24364B"/>
+                <w:sz w:val="17"/>
+              </w:rPr>
+            </w:r>
           </w:p>
         </w:tc>
         <w:tc>
           <w:tcPr>
-            <w:tcW w:type="dxa" w:w="1296"/>
+            <w:tcW w:type="dxa" w:w="1526"/>
+            <w:shd w:fill="FFF9E8"/>
+            <w:vAlign w:val="center"/>
+            <w:tcMar>
+              <w:top w:w="80" w:type="dxa"/>
+              <w:start w:w="120" w:type="dxa"/>
+              <w:bottom w:w="80" w:type="dxa"/>
+              <w:end w:w="120" w:type="dxa"/>
+            </w:tcMar>
           </w:tcPr>
           <w:p>
+            <w:pPr>
+              <w:spacing w:before="40" w:after="40" w:line="276" w:lineRule="auto"/>
+              <w:jc w:val="left"/>
+            </w:pPr>
             <w:r/>
+            <w:r>
+              <w:rPr>
+                <w:rFonts w:ascii="Microsoft YaHei" w:hAnsi="Microsoft YaHei" w:eastAsia="Microsoft YaHei"/>
+                <w:b w:val="0"/>
+                <w:i w:val="0"/>
+                <w:color w:val="24364B"/>
+                <w:sz w:val="17"/>
+              </w:rPr>
+            </w:r>
           </w:p>
         </w:tc>
         <w:tc>
           <w:tcPr>
-            <w:tcW w:type="dxa" w:w="1296"/>
+            <w:tcW w:type="dxa" w:w="1705"/>
+            <w:shd w:fill="FFF9E8"/>
+            <w:vAlign w:val="center"/>
+            <w:tcMar>
+              <w:top w:w="80" w:type="dxa"/>
+              <w:start w:w="120" w:type="dxa"/>
+              <w:bottom w:w="80" w:type="dxa"/>
+              <w:end w:w="120" w:type="dxa"/>
+            </w:tcMar>
           </w:tcPr>
           <w:p>
+            <w:pPr>
+              <w:spacing w:before="40" w:after="40" w:line="276" w:lineRule="auto"/>
+              <w:jc w:val="left"/>
+            </w:pPr>
             <w:r/>
+            <w:r>
+              <w:rPr>
+                <w:rFonts w:ascii="Microsoft YaHei" w:hAnsi="Microsoft YaHei" w:eastAsia="Microsoft YaHei"/>
+                <w:b w:val="0"/>
+                <w:i w:val="0"/>
+                <w:color w:val="24364B"/>
+                <w:sz w:val="17"/>
+              </w:rPr>
+            </w:r>
           </w:p>
         </w:tc>
         <w:tc>
           <w:tcPr>
-            <w:tcW w:type="dxa" w:w="1296"/>
+            <w:tcW w:type="dxa" w:w="1527"/>
+            <w:shd w:fill="FFF9E8"/>
+            <w:vAlign w:val="center"/>
+            <w:tcMar>
+              <w:top w:w="80" w:type="dxa"/>
+              <w:start w:w="120" w:type="dxa"/>
+              <w:bottom w:w="80" w:type="dxa"/>
+              <w:end w:w="120" w:type="dxa"/>
+            </w:tcMar>
           </w:tcPr>
           <w:p>
+            <w:pPr>
+              <w:spacing w:before="40" w:after="40" w:line="276" w:lineRule="auto"/>
+              <w:jc w:val="left"/>
+            </w:pPr>
             <w:r/>
+            <w:r>
+              <w:rPr>
+                <w:rFonts w:ascii="Microsoft YaHei" w:hAnsi="Microsoft YaHei" w:eastAsia="Microsoft YaHei"/>
+                <w:b w:val="0"/>
+                <w:i w:val="0"/>
+                <w:color w:val="24364B"/>
+                <w:sz w:val="17"/>
+              </w:rPr>
+            </w:r>
+          </w:p>
+        </w:tc>
+      </w:tr>
+      <w:tr>
+        <w:trPr>
+          <w:cantSplit/>
+          <w:cantSplit/>
+          <w:cantSplit/>
+          <w:cantSplit/>
+        </w:trPr>
+        <w:tc>
+          <w:tcPr>
+            <w:tcW w:type="dxa" w:w="898"/>
+            <w:shd w:fill="FFFFFF"/>
+            <w:vAlign w:val="center"/>
+            <w:tcMar>
+              <w:top w:w="80" w:type="dxa"/>
+              <w:start w:w="120" w:type="dxa"/>
+              <w:bottom w:w="80" w:type="dxa"/>
+              <w:end w:w="120" w:type="dxa"/>
+            </w:tcMar>
+          </w:tcPr>
+          <w:p>
+            <w:pPr>
+              <w:spacing w:before="40" w:after="40" w:line="276" w:lineRule="auto"/>
+              <w:jc w:val="center"/>
+            </w:pPr>
+            <w:r/>
+            <w:r>
+              <w:rPr>
+                <w:rFonts w:ascii="Microsoft YaHei" w:hAnsi="Microsoft YaHei" w:eastAsia="Microsoft YaHei"/>
+                <w:b w:val="0"/>
+                <w:i w:val="0"/>
+                <w:color w:val="667A90"/>
+                <w:sz w:val="17"/>
+              </w:rPr>
+              <w:t>4</w:t>
+            </w:r>
           </w:p>
         </w:tc>
         <w:tc>
           <w:tcPr>
-            <w:tcW w:type="dxa" w:w="1296"/>
+            <w:tcW w:type="dxa" w:w="2872"/>
+            <w:shd w:fill="FFF9E8"/>
+            <w:vAlign w:val="center"/>
+            <w:tcMar>
+              <w:top w:w="80" w:type="dxa"/>
+              <w:start w:w="120" w:type="dxa"/>
+              <w:bottom w:w="80" w:type="dxa"/>
+              <w:end w:w="120" w:type="dxa"/>
+            </w:tcMar>
           </w:tcPr>
           <w:p>
+            <w:pPr>
+              <w:spacing w:before="40" w:after="40" w:line="276" w:lineRule="auto"/>
+              <w:jc w:val="left"/>
+            </w:pPr>
             <w:r/>
+            <w:r>
+              <w:rPr>
+                <w:rFonts w:ascii="Microsoft YaHei" w:hAnsi="Microsoft YaHei" w:eastAsia="Microsoft YaHei"/>
+                <w:b w:val="0"/>
+                <w:i w:val="0"/>
+                <w:color w:val="24364B"/>
+                <w:sz w:val="17"/>
+              </w:rPr>
+            </w:r>
+          </w:p>
+        </w:tc>
+        <w:tc>
+          <w:tcPr>
+            <w:tcW w:type="dxa" w:w="2423"/>
+            <w:shd w:fill="FFF9E8"/>
+            <w:vAlign w:val="center"/>
+            <w:tcMar>
+              <w:top w:w="80" w:type="dxa"/>
+              <w:start w:w="120" w:type="dxa"/>
+              <w:bottom w:w="80" w:type="dxa"/>
+              <w:end w:w="120" w:type="dxa"/>
+            </w:tcMar>
+          </w:tcPr>
+          <w:p>
+            <w:pPr>
+              <w:spacing w:before="40" w:after="40" w:line="276" w:lineRule="auto"/>
+              <w:jc w:val="left"/>
+            </w:pPr>
+            <w:r/>
+            <w:r>
+              <w:rPr>
+                <w:rFonts w:ascii="Microsoft YaHei" w:hAnsi="Microsoft YaHei" w:eastAsia="Microsoft YaHei"/>
+                <w:b w:val="0"/>
+                <w:i w:val="0"/>
+                <w:color w:val="24364B"/>
+                <w:sz w:val="17"/>
+              </w:rPr>
+            </w:r>
+          </w:p>
+        </w:tc>
+        <w:tc>
+          <w:tcPr>
+            <w:tcW w:type="dxa" w:w="3949"/>
+            <w:shd w:fill="FFF9E8"/>
+            <w:vAlign w:val="center"/>
+            <w:tcMar>
+              <w:top w:w="80" w:type="dxa"/>
+              <w:start w:w="120" w:type="dxa"/>
+              <w:bottom w:w="80" w:type="dxa"/>
+              <w:end w:w="120" w:type="dxa"/>
+            </w:tcMar>
+          </w:tcPr>
+          <w:p>
+            <w:pPr>
+              <w:spacing w:before="40" w:after="40" w:line="276" w:lineRule="auto"/>
+              <w:jc w:val="left"/>
+            </w:pPr>
+            <w:r/>
+            <w:r>
+              <w:rPr>
+                <w:rFonts w:ascii="Microsoft YaHei" w:hAnsi="Microsoft YaHei" w:eastAsia="Microsoft YaHei"/>
+                <w:b w:val="0"/>
+                <w:i w:val="0"/>
+                <w:color w:val="24364B"/>
+                <w:sz w:val="17"/>
+              </w:rPr>
+            </w:r>
+          </w:p>
+        </w:tc>
+        <w:tc>
+          <w:tcPr>
+            <w:tcW w:type="dxa" w:w="1526"/>
+            <w:shd w:fill="FFF9E8"/>
+            <w:vAlign w:val="center"/>
+            <w:tcMar>
+              <w:top w:w="80" w:type="dxa"/>
+              <w:start w:w="120" w:type="dxa"/>
+              <w:bottom w:w="80" w:type="dxa"/>
+              <w:end w:w="120" w:type="dxa"/>
+            </w:tcMar>
+          </w:tcPr>
+          <w:p>
+            <w:pPr>
+              <w:spacing w:before="40" w:after="40" w:line="276" w:lineRule="auto"/>
+              <w:jc w:val="left"/>
+            </w:pPr>
+            <w:r/>
+            <w:r>
+              <w:rPr>
+                <w:rFonts w:ascii="Microsoft YaHei" w:hAnsi="Microsoft YaHei" w:eastAsia="Microsoft YaHei"/>
+                <w:b w:val="0"/>
+                <w:i w:val="0"/>
+                <w:color w:val="24364B"/>
+                <w:sz w:val="17"/>
+              </w:rPr>
+            </w:r>
+          </w:p>
+        </w:tc>
+        <w:tc>
+          <w:tcPr>
+            <w:tcW w:type="dxa" w:w="1705"/>
+            <w:shd w:fill="FFF9E8"/>
+            <w:vAlign w:val="center"/>
+            <w:tcMar>
+              <w:top w:w="80" w:type="dxa"/>
+              <w:start w:w="120" w:type="dxa"/>
+              <w:bottom w:w="80" w:type="dxa"/>
+              <w:end w:w="120" w:type="dxa"/>
+            </w:tcMar>
+          </w:tcPr>
+          <w:p>
+            <w:pPr>
+              <w:spacing w:before="40" w:after="40" w:line="276" w:lineRule="auto"/>
+              <w:jc w:val="left"/>
+            </w:pPr>
+            <w:r/>
+            <w:r>
+              <w:rPr>
+                <w:rFonts w:ascii="Microsoft YaHei" w:hAnsi="Microsoft YaHei" w:eastAsia="Microsoft YaHei"/>
+                <w:b w:val="0"/>
+                <w:i w:val="0"/>
+                <w:color w:val="24364B"/>
+                <w:sz w:val="17"/>
+              </w:rPr>
+            </w:r>
+          </w:p>
+        </w:tc>
+        <w:tc>
+          <w:tcPr>
+            <w:tcW w:type="dxa" w:w="1527"/>
+            <w:shd w:fill="FFF9E8"/>
+            <w:vAlign w:val="center"/>
+            <w:tcMar>
+              <w:top w:w="80" w:type="dxa"/>
+              <w:start w:w="120" w:type="dxa"/>
+              <w:bottom w:w="80" w:type="dxa"/>
+              <w:end w:w="120" w:type="dxa"/>
+            </w:tcMar>
+          </w:tcPr>
+          <w:p>
+            <w:pPr>
+              <w:spacing w:before="40" w:after="40" w:line="276" w:lineRule="auto"/>
+              <w:jc w:val="left"/>
+            </w:pPr>
+            <w:r/>
+            <w:r>
+              <w:rPr>
+                <w:rFonts w:ascii="Microsoft YaHei" w:hAnsi="Microsoft YaHei" w:eastAsia="Microsoft YaHei"/>
+                <w:b w:val="0"/>
+                <w:i w:val="0"/>
+                <w:color w:val="24364B"/>
+                <w:sz w:val="17"/>
+              </w:rPr>
+            </w:r>
           </w:p>
         </w:tc>
       </w:tr>
       <w:tr>
+        <w:trPr>
+          <w:cantSplit/>
+          <w:cantSplit/>
+          <w:cantSplit/>
+        </w:trPr>
         <w:tc>
           <w:tcPr>
-            <w:tcW w:type="dxa" w:w="1296"/>
+            <w:tcW w:type="dxa" w:w="898"/>
+            <w:shd w:fill="FFFFFF"/>
+            <w:vAlign w:val="center"/>
+            <w:tcMar>
+              <w:top w:w="80" w:type="dxa"/>
+              <w:start w:w="120" w:type="dxa"/>
+              <w:bottom w:w="80" w:type="dxa"/>
+              <w:end w:w="120" w:type="dxa"/>
+            </w:tcMar>
           </w:tcPr>
           <w:p>
+            <w:pPr>
+              <w:spacing w:before="40" w:after="40" w:line="276" w:lineRule="auto"/>
+              <w:jc w:val="center"/>
+            </w:pPr>
             <w:r/>
+            <w:r>
+              <w:rPr>
+                <w:rFonts w:ascii="Microsoft YaHei" w:hAnsi="Microsoft YaHei" w:eastAsia="Microsoft YaHei"/>
+                <w:b w:val="0"/>
+                <w:i w:val="0"/>
+                <w:color w:val="667A90"/>
+                <w:sz w:val="17"/>
+              </w:rPr>
+              <w:t>5</w:t>
+            </w:r>
           </w:p>
         </w:tc>
         <w:tc>
           <w:tcPr>
-            <w:tcW w:type="dxa" w:w="1296"/>
+            <w:tcW w:type="dxa" w:w="2872"/>
+            <w:shd w:fill="FFF9E8"/>
+            <w:vAlign w:val="center"/>
+            <w:tcMar>
+              <w:top w:w="80" w:type="dxa"/>
+              <w:start w:w="120" w:type="dxa"/>
+              <w:bottom w:w="80" w:type="dxa"/>
+              <w:end w:w="120" w:type="dxa"/>
+            </w:tcMar>
           </w:tcPr>
           <w:p>
+            <w:pPr>
+              <w:spacing w:before="40" w:after="40" w:line="276" w:lineRule="auto"/>
+              <w:jc w:val="left"/>
+            </w:pPr>
             <w:r/>
+            <w:r>
+              <w:rPr>
+                <w:rFonts w:ascii="Microsoft YaHei" w:hAnsi="Microsoft YaHei" w:eastAsia="Microsoft YaHei"/>
+                <w:b w:val="0"/>
+                <w:i w:val="0"/>
+                <w:color w:val="24364B"/>
+                <w:sz w:val="17"/>
+              </w:rPr>
+            </w:r>
           </w:p>
         </w:tc>
         <w:tc>
           <w:tcPr>
-            <w:tcW w:type="dxa" w:w="1296"/>
+            <w:tcW w:type="dxa" w:w="2423"/>
+            <w:shd w:fill="FFF9E8"/>
+            <w:vAlign w:val="center"/>
+            <w:tcMar>
+              <w:top w:w="80" w:type="dxa"/>
+              <w:start w:w="120" w:type="dxa"/>
+              <w:bottom w:w="80" w:type="dxa"/>
+              <w:end w:w="120" w:type="dxa"/>
+            </w:tcMar>
           </w:tcPr>
           <w:p>
+            <w:pPr>
+              <w:spacing w:before="40" w:after="40" w:line="276" w:lineRule="auto"/>
+              <w:jc w:val="left"/>
+            </w:pPr>
             <w:r/>
+            <w:r>
+              <w:rPr>
+                <w:rFonts w:ascii="Microsoft YaHei" w:hAnsi="Microsoft YaHei" w:eastAsia="Microsoft YaHei"/>
+                <w:b w:val="0"/>
+                <w:i w:val="0"/>
+                <w:color w:val="24364B"/>
+                <w:sz w:val="17"/>
+              </w:rPr>
+            </w:r>
           </w:p>
         </w:tc>
         <w:tc>
           <w:tcPr>
-            <w:tcW w:type="dxa" w:w="1296"/>
+            <w:tcW w:type="dxa" w:w="3949"/>
+            <w:shd w:fill="FFF9E8"/>
+            <w:vAlign w:val="center"/>
+            <w:tcMar>
+              <w:top w:w="80" w:type="dxa"/>
+              <w:start w:w="120" w:type="dxa"/>
+              <w:bottom w:w="80" w:type="dxa"/>
+              <w:end w:w="120" w:type="dxa"/>
+            </w:tcMar>
           </w:tcPr>
           <w:p>
+            <w:pPr>
+              <w:spacing w:before="40" w:after="40" w:line="276" w:lineRule="auto"/>
+              <w:jc w:val="left"/>
+            </w:pPr>
             <w:r/>
+            <w:r>
+              <w:rPr>
+                <w:rFonts w:ascii="Microsoft YaHei" w:hAnsi="Microsoft YaHei" w:eastAsia="Microsoft YaHei"/>
+                <w:b w:val="0"/>
+                <w:i w:val="0"/>
+                <w:color w:val="24364B"/>
+                <w:sz w:val="17"/>
+              </w:rPr>
+            </w:r>
           </w:p>
         </w:tc>
         <w:tc>
           <w:tcPr>
-            <w:tcW w:type="dxa" w:w="1296"/>
+            <w:tcW w:type="dxa" w:w="1526"/>
+            <w:shd w:fill="FFF9E8"/>
+            <w:vAlign w:val="center"/>
+            <w:tcMar>
+              <w:top w:w="80" w:type="dxa"/>
+              <w:start w:w="120" w:type="dxa"/>
+              <w:bottom w:w="80" w:type="dxa"/>
+              <w:end w:w="120" w:type="dxa"/>
+            </w:tcMar>
           </w:tcPr>
           <w:p>
+            <w:pPr>
+              <w:spacing w:before="40" w:after="40" w:line="276" w:lineRule="auto"/>
+              <w:jc w:val="left"/>
+            </w:pPr>
             <w:r/>
+            <w:r>
+              <w:rPr>
+                <w:rFonts w:ascii="Microsoft YaHei" w:hAnsi="Microsoft YaHei" w:eastAsia="Microsoft YaHei"/>
+                <w:b w:val="0"/>
+                <w:i w:val="0"/>
+                <w:color w:val="24364B"/>
+                <w:sz w:val="17"/>
+              </w:rPr>
+            </w:r>
           </w:p>
         </w:tc>
         <w:tc>
           <w:tcPr>
-            <w:tcW w:type="dxa" w:w="1296"/>
+            <w:tcW w:type="dxa" w:w="1705"/>
+            <w:shd w:fill="FFF9E8"/>
+            <w:vAlign w:val="center"/>
+            <w:tcMar>
+              <w:top w:w="80" w:type="dxa"/>
+              <w:start w:w="120" w:type="dxa"/>
+              <w:bottom w:w="80" w:type="dxa"/>
+              <w:end w:w="120" w:type="dxa"/>
+            </w:tcMar>
           </w:tcPr>
           <w:p>
+            <w:pPr>
+              <w:spacing w:before="40" w:after="40" w:line="276" w:lineRule="auto"/>
+              <w:jc w:val="left"/>
+            </w:pPr>
             <w:r/>
+            <w:r>
+              <w:rPr>
+                <w:rFonts w:ascii="Microsoft YaHei" w:hAnsi="Microsoft YaHei" w:eastAsia="Microsoft YaHei"/>
+                <w:b w:val="0"/>
+                <w:i w:val="0"/>
+                <w:color w:val="24364B"/>
+                <w:sz w:val="17"/>
+              </w:rPr>
+            </w:r>
           </w:p>
         </w:tc>
         <w:tc>
           <w:tcPr>
-            <w:tcW w:type="dxa" w:w="1296"/>
+            <w:tcW w:type="dxa" w:w="1527"/>
+            <w:shd w:fill="FFF9E8"/>
+            <w:vAlign w:val="center"/>
+            <w:tcMar>
+              <w:top w:w="80" w:type="dxa"/>
+              <w:start w:w="120" w:type="dxa"/>
+              <w:bottom w:w="80" w:type="dxa"/>
+              <w:end w:w="120" w:type="dxa"/>
+            </w:tcMar>
           </w:tcPr>
           <w:p>
+            <w:pPr>
+              <w:spacing w:before="40" w:after="40" w:line="276" w:lineRule="auto"/>
+              <w:jc w:val="left"/>
+            </w:pPr>
             <w:r/>
+            <w:r>
+              <w:rPr>
+                <w:rFonts w:ascii="Microsoft YaHei" w:hAnsi="Microsoft YaHei" w:eastAsia="Microsoft YaHei"/>
+                <w:b w:val="0"/>
+                <w:i w:val="0"/>
+                <w:color w:val="24364B"/>
+                <w:sz w:val="17"/>
+              </w:rPr>
+            </w:r>
+          </w:p>
+        </w:tc>
+      </w:tr>
+      <w:tr>
+        <w:trPr>
+          <w:cantSplit/>
+          <w:cantSplit/>
+        </w:trPr>
+        <w:tc>
+          <w:tcPr>
+            <w:tcW w:type="dxa" w:w="898"/>
+            <w:shd w:fill="FFFFFF"/>
+            <w:vAlign w:val="center"/>
+            <w:tcMar>
+              <w:top w:w="80" w:type="dxa"/>
+              <w:start w:w="120" w:type="dxa"/>
+              <w:bottom w:w="80" w:type="dxa"/>
+              <w:end w:w="120" w:type="dxa"/>
+            </w:tcMar>
+          </w:tcPr>
+          <w:p>
+            <w:pPr>
+              <w:spacing w:before="40" w:after="40" w:line="276" w:lineRule="auto"/>
+              <w:jc w:val="center"/>
+            </w:pPr>
+            <w:r/>
+            <w:r>
+              <w:rPr>
+                <w:rFonts w:ascii="Microsoft YaHei" w:hAnsi="Microsoft YaHei" w:eastAsia="Microsoft YaHei"/>
+                <w:b w:val="0"/>
+                <w:i w:val="0"/>
+                <w:color w:val="667A90"/>
+                <w:sz w:val="17"/>
+              </w:rPr>
+              <w:t>6</w:t>
+            </w:r>
           </w:p>
         </w:tc>
         <w:tc>
           <w:tcPr>
-            <w:tcW w:type="dxa" w:w="1296"/>
+            <w:tcW w:type="dxa" w:w="2872"/>
+            <w:shd w:fill="FFF9E8"/>
+            <w:vAlign w:val="center"/>
+            <w:tcMar>
+              <w:top w:w="80" w:type="dxa"/>
+              <w:start w:w="120" w:type="dxa"/>
+              <w:bottom w:w="80" w:type="dxa"/>
+              <w:end w:w="120" w:type="dxa"/>
+            </w:tcMar>
           </w:tcPr>
           <w:p>
+            <w:pPr>
+              <w:spacing w:before="40" w:after="40" w:line="276" w:lineRule="auto"/>
+              <w:jc w:val="left"/>
+            </w:pPr>
             <w:r/>
+            <w:r>
+              <w:rPr>
+                <w:rFonts w:ascii="Microsoft YaHei" w:hAnsi="Microsoft YaHei" w:eastAsia="Microsoft YaHei"/>
+                <w:b w:val="0"/>
+                <w:i w:val="0"/>
+                <w:color w:val="24364B"/>
+                <w:sz w:val="17"/>
+              </w:rPr>
+            </w:r>
+          </w:p>
+        </w:tc>
+        <w:tc>
+          <w:tcPr>
+            <w:tcW w:type="dxa" w:w="2423"/>
+            <w:shd w:fill="FFF9E8"/>
+            <w:vAlign w:val="center"/>
+            <w:tcMar>
+              <w:top w:w="80" w:type="dxa"/>
+              <w:start w:w="120" w:type="dxa"/>
+              <w:bottom w:w="80" w:type="dxa"/>
+              <w:end w:w="120" w:type="dxa"/>
+            </w:tcMar>
+          </w:tcPr>
+          <w:p>
+            <w:pPr>
+              <w:spacing w:before="40" w:after="40" w:line="276" w:lineRule="auto"/>
+              <w:jc w:val="left"/>
+            </w:pPr>
+            <w:r/>
+            <w:r>
+              <w:rPr>
+                <w:rFonts w:ascii="Microsoft YaHei" w:hAnsi="Microsoft YaHei" w:eastAsia="Microsoft YaHei"/>
+                <w:b w:val="0"/>
+                <w:i w:val="0"/>
+                <w:color w:val="24364B"/>
+                <w:sz w:val="17"/>
+              </w:rPr>
+            </w:r>
+          </w:p>
+        </w:tc>
+        <w:tc>
+          <w:tcPr>
+            <w:tcW w:type="dxa" w:w="3949"/>
+            <w:shd w:fill="FFF9E8"/>
+            <w:vAlign w:val="center"/>
+            <w:tcMar>
+              <w:top w:w="80" w:type="dxa"/>
+              <w:start w:w="120" w:type="dxa"/>
+              <w:bottom w:w="80" w:type="dxa"/>
+              <w:end w:w="120" w:type="dxa"/>
+            </w:tcMar>
+          </w:tcPr>
+          <w:p>
+            <w:pPr>
+              <w:spacing w:before="40" w:after="40" w:line="276" w:lineRule="auto"/>
+              <w:jc w:val="left"/>
+            </w:pPr>
+            <w:r/>
+            <w:r>
+              <w:rPr>
+                <w:rFonts w:ascii="Microsoft YaHei" w:hAnsi="Microsoft YaHei" w:eastAsia="Microsoft YaHei"/>
+                <w:b w:val="0"/>
+                <w:i w:val="0"/>
+                <w:color w:val="24364B"/>
+                <w:sz w:val="17"/>
+              </w:rPr>
+            </w:r>
+          </w:p>
+        </w:tc>
+        <w:tc>
+          <w:tcPr>
+            <w:tcW w:type="dxa" w:w="1526"/>
+            <w:shd w:fill="FFF9E8"/>
+            <w:vAlign w:val="center"/>
+            <w:tcMar>
+              <w:top w:w="80" w:type="dxa"/>
+              <w:start w:w="120" w:type="dxa"/>
+              <w:bottom w:w="80" w:type="dxa"/>
+              <w:end w:w="120" w:type="dxa"/>
+            </w:tcMar>
+          </w:tcPr>
+          <w:p>
+            <w:pPr>
+              <w:spacing w:before="40" w:after="40" w:line="276" w:lineRule="auto"/>
+              <w:jc w:val="left"/>
+            </w:pPr>
+            <w:r/>
+            <w:r>
+              <w:rPr>
+                <w:rFonts w:ascii="Microsoft YaHei" w:hAnsi="Microsoft YaHei" w:eastAsia="Microsoft YaHei"/>
+                <w:b w:val="0"/>
+                <w:i w:val="0"/>
+                <w:color w:val="24364B"/>
+                <w:sz w:val="17"/>
+              </w:rPr>
+            </w:r>
+          </w:p>
+        </w:tc>
+        <w:tc>
+          <w:tcPr>
+            <w:tcW w:type="dxa" w:w="1705"/>
+            <w:shd w:fill="FFF9E8"/>
+            <w:vAlign w:val="center"/>
+            <w:tcMar>
+              <w:top w:w="80" w:type="dxa"/>
+              <w:start w:w="120" w:type="dxa"/>
+              <w:bottom w:w="80" w:type="dxa"/>
+              <w:end w:w="120" w:type="dxa"/>
+            </w:tcMar>
+          </w:tcPr>
+          <w:p>
+            <w:pPr>
+              <w:spacing w:before="40" w:after="40" w:line="276" w:lineRule="auto"/>
+              <w:jc w:val="left"/>
+            </w:pPr>
+            <w:r/>
+            <w:r>
+              <w:rPr>
+                <w:rFonts w:ascii="Microsoft YaHei" w:hAnsi="Microsoft YaHei" w:eastAsia="Microsoft YaHei"/>
+                <w:b w:val="0"/>
+                <w:i w:val="0"/>
+                <w:color w:val="24364B"/>
+                <w:sz w:val="17"/>
+              </w:rPr>
+            </w:r>
+          </w:p>
+        </w:tc>
+        <w:tc>
+          <w:tcPr>
+            <w:tcW w:type="dxa" w:w="1527"/>
+            <w:shd w:fill="FFF9E8"/>
+            <w:vAlign w:val="center"/>
+            <w:tcMar>
+              <w:top w:w="80" w:type="dxa"/>
+              <w:start w:w="120" w:type="dxa"/>
+              <w:bottom w:w="80" w:type="dxa"/>
+              <w:end w:w="120" w:type="dxa"/>
+            </w:tcMar>
+          </w:tcPr>
+          <w:p>
+            <w:pPr>
+              <w:spacing w:before="40" w:after="40" w:line="276" w:lineRule="auto"/>
+              <w:jc w:val="left"/>
+            </w:pPr>
+            <w:r/>
+            <w:r>
+              <w:rPr>
+                <w:rFonts w:ascii="Microsoft YaHei" w:hAnsi="Microsoft YaHei" w:eastAsia="Microsoft YaHei"/>
+                <w:b w:val="0"/>
+                <w:i w:val="0"/>
+                <w:color w:val="24364B"/>
+                <w:sz w:val="17"/>
+              </w:rPr>
+            </w:r>
+          </w:p>
+        </w:tc>
+      </w:tr>
+    </w:tbl>
+    <w:p>
+      <w:pPr>
+        <w:pStyle w:val="Heading2"/>
+        <w:keepNext/>
+      </w:pPr>
+      <w:r>
+        <w:rPr>
+          <w:rFonts w:ascii="Microsoft YaHei" w:hAnsi="Microsoft YaHei" w:eastAsia="Microsoft YaHei"/>
+          <w:b/>
+          <w:i w:val="0"/>
+          <w:color w:val="1769E0"/>
+          <w:sz w:val="26"/>
+        </w:rPr>
+        <w:t>四、质量核对</w:t>
+      </w:r>
+    </w:p>
+    <w:tbl>
+      <w:tblPr>
+        <w:tblStyle w:val="TableGrid"/>
+        <w:tblW w:type="dxa" w:w="14900"/>
+        <w:tblLayout w:type="fixed"/>
+        <w:tblLook w:firstColumn="1" w:firstRow="1" w:lastColumn="0" w:lastRow="0" w:noHBand="0" w:noVBand="1" w:val="04A0"/>
+        <w:jc w:val="left"/>
+        <w:tblInd w:w="120" w:type="dxa"/>
+        <w:tblBorders>
+          <w:top w:val="single" w:sz="5" w:color="C8D8EA"/>
+          <w:left w:val="single" w:sz="5" w:color="C8D8EA"/>
+          <w:bottom w:val="single" w:sz="5" w:color="C8D8EA"/>
+          <w:right w:val="single" w:sz="5" w:color="C8D8EA"/>
+          <w:insideH w:val="single" w:sz="5" w:color="C8D8EA"/>
+          <w:insideV w:val="single" w:sz="5" w:color="C8D8EA"/>
+        </w:tblBorders>
+      </w:tblPr>
+      <w:tblGrid>
+        <w:gridCol w:w="1104"/>
+        <w:gridCol w:w="2299"/>
+        <w:gridCol w:w="9014"/>
+        <w:gridCol w:w="2483"/>
+      </w:tblGrid>
+      <w:tr>
+        <w:trPr>
+          <w:cantSplit/>
+          <w:cantSplit/>
+        </w:trPr>
+        <w:tc>
+          <w:tcPr>
+            <w:tcW w:type="dxa" w:w="1104"/>
+            <w:shd w:fill="17365D"/>
+            <w:vAlign w:val="center"/>
+            <w:tcMar>
+              <w:top w:w="80" w:type="dxa"/>
+              <w:start w:w="120" w:type="dxa"/>
+              <w:bottom w:w="80" w:type="dxa"/>
+              <w:end w:w="120" w:type="dxa"/>
+            </w:tcMar>
+          </w:tcPr>
+          <w:p>
+            <w:pPr>
+              <w:spacing w:before="40" w:after="40" w:line="276" w:lineRule="auto"/>
+              <w:jc w:val="center"/>
+            </w:pPr>
+            <w:r/>
+            <w:r>
+              <w:rPr>
+                <w:rFonts w:ascii="Microsoft YaHei" w:hAnsi="Microsoft YaHei" w:eastAsia="Microsoft YaHei"/>
+                <w:b/>
+                <w:i w:val="0"/>
+                <w:color w:val="FFFFFF"/>
+                <w:sz w:val="17"/>
+              </w:rPr>
+              <w:t>序号</w:t>
+            </w:r>
+          </w:p>
+        </w:tc>
+        <w:tc>
+          <w:tcPr>
+            <w:tcW w:type="dxa" w:w="2299"/>
+            <w:shd w:fill="17365D"/>
+            <w:vAlign w:val="center"/>
+            <w:tcMar>
+              <w:top w:w="80" w:type="dxa"/>
+              <w:start w:w="120" w:type="dxa"/>
+              <w:bottom w:w="80" w:type="dxa"/>
+              <w:end w:w="120" w:type="dxa"/>
+            </w:tcMar>
+          </w:tcPr>
+          <w:p>
+            <w:pPr>
+              <w:spacing w:before="40" w:after="40" w:line="276" w:lineRule="auto"/>
+              <w:jc w:val="center"/>
+            </w:pPr>
+            <w:r/>
+            <w:r>
+              <w:rPr>
+                <w:rFonts w:ascii="Microsoft YaHei" w:hAnsi="Microsoft YaHei" w:eastAsia="Microsoft YaHei"/>
+                <w:b/>
+                <w:i w:val="0"/>
+                <w:color w:val="FFFFFF"/>
+                <w:sz w:val="17"/>
+              </w:rPr>
+              <w:t>检查维度</w:t>
+            </w:r>
+          </w:p>
+        </w:tc>
+        <w:tc>
+          <w:tcPr>
+            <w:tcW w:type="dxa" w:w="9014"/>
+            <w:shd w:fill="17365D"/>
+            <w:vAlign w:val="center"/>
+            <w:tcMar>
+              <w:top w:w="80" w:type="dxa"/>
+              <w:start w:w="120" w:type="dxa"/>
+              <w:bottom w:w="80" w:type="dxa"/>
+              <w:end w:w="120" w:type="dxa"/>
+            </w:tcMar>
+          </w:tcPr>
+          <w:p>
+            <w:pPr>
+              <w:spacing w:before="40" w:after="40" w:line="276" w:lineRule="auto"/>
+              <w:jc w:val="center"/>
+            </w:pPr>
+            <w:r/>
+            <w:r>
+              <w:rPr>
+                <w:rFonts w:ascii="Microsoft YaHei" w:hAnsi="Microsoft YaHei" w:eastAsia="Microsoft YaHei"/>
+                <w:b/>
+                <w:i w:val="0"/>
+                <w:color w:val="FFFFFF"/>
+                <w:sz w:val="17"/>
+              </w:rPr>
+              <w:t>核对要求</w:t>
+            </w:r>
+          </w:p>
+        </w:tc>
+        <w:tc>
+          <w:tcPr>
+            <w:tcW w:type="dxa" w:w="2483"/>
+            <w:shd w:fill="17365D"/>
+            <w:vAlign w:val="center"/>
+            <w:tcMar>
+              <w:top w:w="80" w:type="dxa"/>
+              <w:start w:w="120" w:type="dxa"/>
+              <w:bottom w:w="80" w:type="dxa"/>
+              <w:end w:w="120" w:type="dxa"/>
+            </w:tcMar>
+          </w:tcPr>
+          <w:p>
+            <w:pPr>
+              <w:spacing w:before="40" w:after="40" w:line="276" w:lineRule="auto"/>
+              <w:jc w:val="center"/>
+            </w:pPr>
+            <w:r/>
+            <w:r>
+              <w:rPr>
+                <w:rFonts w:ascii="Microsoft YaHei" w:hAnsi="Microsoft YaHei" w:eastAsia="Microsoft YaHei"/>
+                <w:b/>
+                <w:i w:val="0"/>
+                <w:color w:val="FFFFFF"/>
+                <w:sz w:val="17"/>
+              </w:rPr>
+              <w:t>结论</w:t>
+            </w:r>
           </w:p>
         </w:tc>
       </w:tr>
       <w:tr>
+        <w:trPr>
+          <w:cantSplit/>
+          <w:cantSplit/>
+        </w:trPr>
         <w:tc>
           <w:tcPr>
-            <w:tcW w:type="dxa" w:w="1296"/>
+            <w:tcW w:type="dxa" w:w="1104"/>
+            <w:shd w:fill="FFFFFF"/>
+            <w:vAlign w:val="center"/>
+            <w:tcMar>
+              <w:top w:w="80" w:type="dxa"/>
+              <w:start w:w="120" w:type="dxa"/>
+              <w:bottom w:w="80" w:type="dxa"/>
+              <w:end w:w="120" w:type="dxa"/>
+            </w:tcMar>
           </w:tcPr>
           <w:p>
+            <w:pPr>
+              <w:spacing w:before="40" w:after="40" w:line="276" w:lineRule="auto"/>
+              <w:jc w:val="center"/>
+            </w:pPr>
             <w:r/>
+            <w:r>
+              <w:rPr>
+                <w:rFonts w:ascii="Microsoft YaHei" w:hAnsi="Microsoft YaHei" w:eastAsia="Microsoft YaHei"/>
+                <w:b w:val="0"/>
+                <w:i w:val="0"/>
+                <w:color w:val="24364B"/>
+                <w:sz w:val="17"/>
+              </w:rPr>
+              <w:t>1</w:t>
+            </w:r>
           </w:p>
         </w:tc>
         <w:tc>
           <w:tcPr>
-            <w:tcW w:type="dxa" w:w="1296"/>
+            <w:tcW w:type="dxa" w:w="2299"/>
+            <w:shd w:fill="FFFFFF"/>
+            <w:vAlign w:val="center"/>
+            <w:tcMar>
+              <w:top w:w="80" w:type="dxa"/>
+              <w:start w:w="120" w:type="dxa"/>
+              <w:bottom w:w="80" w:type="dxa"/>
+              <w:end w:w="120" w:type="dxa"/>
+            </w:tcMar>
           </w:tcPr>
           <w:p>
+            <w:pPr>
+              <w:spacing w:before="40" w:after="40" w:line="276" w:lineRule="auto"/>
+              <w:jc w:val="center"/>
+            </w:pPr>
             <w:r/>
+            <w:r>
+              <w:rPr>
+                <w:rFonts w:ascii="Microsoft YaHei" w:hAnsi="Microsoft YaHei" w:eastAsia="Microsoft YaHei"/>
+                <w:b w:val="0"/>
+                <w:i w:val="0"/>
+                <w:color w:val="24364B"/>
+                <w:sz w:val="17"/>
+              </w:rPr>
+              <w:t>正常链路</w:t>
+            </w:r>
           </w:p>
         </w:tc>
         <w:tc>
           <w:tcPr>
-            <w:tcW w:type="dxa" w:w="1296"/>
+            <w:tcW w:type="dxa" w:w="9014"/>
+            <w:shd w:fill="FFFFFF"/>
+            <w:vAlign w:val="center"/>
+            <w:tcMar>
+              <w:top w:w="80" w:type="dxa"/>
+              <w:start w:w="120" w:type="dxa"/>
+              <w:bottom w:w="80" w:type="dxa"/>
+              <w:end w:w="120" w:type="dxa"/>
+            </w:tcMar>
           </w:tcPr>
           <w:p>
+            <w:pPr>
+              <w:spacing w:before="40" w:after="40" w:line="276" w:lineRule="auto"/>
+              <w:jc w:val="left"/>
+            </w:pPr>
             <w:r/>
+            <w:r>
+              <w:rPr>
+                <w:rFonts w:ascii="Microsoft YaHei" w:hAnsi="Microsoft YaHei" w:eastAsia="Microsoft YaHei"/>
+                <w:b w:val="0"/>
+                <w:i w:val="0"/>
+                <w:color w:val="24364B"/>
+                <w:sz w:val="17"/>
+              </w:rPr>
+              <w:t>触发条件、调用顺序、响应和落库节点清晰</w:t>
+            </w:r>
           </w:p>
         </w:tc>
         <w:tc>
           <w:tcPr>
-            <w:tcW w:type="dxa" w:w="1296"/>
+            <w:tcW w:type="dxa" w:w="2483"/>
+            <w:shd w:fill="FFF9E8"/>
+            <w:vAlign w:val="center"/>
+            <w:tcMar>
+              <w:top w:w="80" w:type="dxa"/>
+              <w:start w:w="120" w:type="dxa"/>
+              <w:bottom w:w="80" w:type="dxa"/>
+              <w:end w:w="120" w:type="dxa"/>
+            </w:tcMar>
           </w:tcPr>
           <w:p>
+            <w:pPr>
+              <w:spacing w:before="40" w:after="40" w:line="276" w:lineRule="auto"/>
+              <w:jc w:val="center"/>
+            </w:pPr>
             <w:r/>
+            <w:r>
+              <w:rPr>
+                <w:rFonts w:ascii="Microsoft YaHei" w:hAnsi="Microsoft YaHei" w:eastAsia="Microsoft YaHei"/>
+                <w:b w:val="0"/>
+                <w:i w:val="0"/>
+                <w:color w:val="24364B"/>
+                <w:sz w:val="17"/>
+              </w:rPr>
+              <w:t>☐ 通过  ☐ 不通过  ☐ 不适用</w:t>
+            </w:r>
+          </w:p>
+        </w:tc>
+      </w:tr>
+      <w:tr>
+        <w:trPr>
+          <w:cantSplit/>
+          <w:cantSplit/>
+        </w:trPr>
+        <w:tc>
+          <w:tcPr>
+            <w:tcW w:type="dxa" w:w="1104"/>
+            <w:shd w:fill="FFFFFF"/>
+            <w:vAlign w:val="center"/>
+            <w:tcMar>
+              <w:top w:w="80" w:type="dxa"/>
+              <w:start w:w="120" w:type="dxa"/>
+              <w:bottom w:w="80" w:type="dxa"/>
+              <w:end w:w="120" w:type="dxa"/>
+            </w:tcMar>
+          </w:tcPr>
+          <w:p>
+            <w:pPr>
+              <w:spacing w:before="40" w:after="40" w:line="276" w:lineRule="auto"/>
+              <w:jc w:val="center"/>
+            </w:pPr>
+            <w:r/>
+            <w:r>
+              <w:rPr>
+                <w:rFonts w:ascii="Microsoft YaHei" w:hAnsi="Microsoft YaHei" w:eastAsia="Microsoft YaHei"/>
+                <w:b w:val="0"/>
+                <w:i w:val="0"/>
+                <w:color w:val="24364B"/>
+                <w:sz w:val="17"/>
+              </w:rPr>
+              <w:t>2</w:t>
+            </w:r>
           </w:p>
         </w:tc>
         <w:tc>
           <w:tcPr>
-            <w:tcW w:type="dxa" w:w="1296"/>
+            <w:tcW w:type="dxa" w:w="2299"/>
+            <w:shd w:fill="FFFFFF"/>
+            <w:vAlign w:val="center"/>
+            <w:tcMar>
+              <w:top w:w="80" w:type="dxa"/>
+              <w:start w:w="120" w:type="dxa"/>
+              <w:bottom w:w="80" w:type="dxa"/>
+              <w:end w:w="120" w:type="dxa"/>
+            </w:tcMar>
           </w:tcPr>
           <w:p>
+            <w:pPr>
+              <w:spacing w:before="40" w:after="40" w:line="276" w:lineRule="auto"/>
+              <w:jc w:val="center"/>
+            </w:pPr>
             <w:r/>
+            <w:r>
+              <w:rPr>
+                <w:rFonts w:ascii="Microsoft YaHei" w:hAnsi="Microsoft YaHei" w:eastAsia="Microsoft YaHei"/>
+                <w:b w:val="0"/>
+                <w:i w:val="0"/>
+                <w:color w:val="24364B"/>
+                <w:sz w:val="17"/>
+              </w:rPr>
+              <w:t>异常分支</w:t>
+            </w:r>
           </w:p>
         </w:tc>
         <w:tc>
           <w:tcPr>
-            <w:tcW w:type="dxa" w:w="1296"/>
+            <w:tcW w:type="dxa" w:w="9014"/>
+            <w:shd w:fill="FFFFFF"/>
+            <w:vAlign w:val="center"/>
+            <w:tcMar>
+              <w:top w:w="80" w:type="dxa"/>
+              <w:start w:w="120" w:type="dxa"/>
+              <w:bottom w:w="80" w:type="dxa"/>
+              <w:end w:w="120" w:type="dxa"/>
+            </w:tcMar>
           </w:tcPr>
           <w:p>
+            <w:pPr>
+              <w:spacing w:before="40" w:after="40" w:line="276" w:lineRule="auto"/>
+              <w:jc w:val="left"/>
+            </w:pPr>
             <w:r/>
+            <w:r>
+              <w:rPr>
+                <w:rFonts w:ascii="Microsoft YaHei" w:hAnsi="Microsoft YaHei" w:eastAsia="Microsoft YaHei"/>
+                <w:b w:val="0"/>
+                <w:i w:val="0"/>
+                <w:color w:val="24364B"/>
+                <w:sz w:val="17"/>
+              </w:rPr>
+              <w:t>超时、失败、重试、回退和人工补偿已覆盖</w:t>
+            </w:r>
           </w:p>
         </w:tc>
         <w:tc>
           <w:tcPr>
-            <w:tcW w:type="dxa" w:w="1296"/>
+            <w:tcW w:type="dxa" w:w="2483"/>
+            <w:shd w:fill="FFF9E8"/>
+            <w:vAlign w:val="center"/>
+            <w:tcMar>
+              <w:top w:w="80" w:type="dxa"/>
+              <w:start w:w="120" w:type="dxa"/>
+              <w:bottom w:w="80" w:type="dxa"/>
+              <w:end w:w="120" w:type="dxa"/>
+            </w:tcMar>
           </w:tcPr>
           <w:p>
+            <w:pPr>
+              <w:spacing w:before="40" w:after="40" w:line="276" w:lineRule="auto"/>
+              <w:jc w:val="center"/>
+            </w:pPr>
             <w:r/>
+            <w:r>
+              <w:rPr>
+                <w:rFonts w:ascii="Microsoft YaHei" w:hAnsi="Microsoft YaHei" w:eastAsia="Microsoft YaHei"/>
+                <w:b w:val="0"/>
+                <w:i w:val="0"/>
+                <w:color w:val="24364B"/>
+                <w:sz w:val="17"/>
+              </w:rPr>
+              <w:t>☐ 通过  ☐ 不通过  ☐ 不适用</w:t>
+            </w:r>
+          </w:p>
+        </w:tc>
+      </w:tr>
+      <w:tr>
+        <w:trPr>
+          <w:cantSplit/>
+          <w:cantSplit/>
+        </w:trPr>
+        <w:tc>
+          <w:tcPr>
+            <w:tcW w:type="dxa" w:w="1104"/>
+            <w:shd w:fill="FFFFFF"/>
+            <w:vAlign w:val="center"/>
+            <w:tcMar>
+              <w:top w:w="80" w:type="dxa"/>
+              <w:start w:w="120" w:type="dxa"/>
+              <w:bottom w:w="80" w:type="dxa"/>
+              <w:end w:w="120" w:type="dxa"/>
+            </w:tcMar>
+          </w:tcPr>
+          <w:p>
+            <w:pPr>
+              <w:spacing w:before="40" w:after="40" w:line="276" w:lineRule="auto"/>
+              <w:jc w:val="center"/>
+            </w:pPr>
+            <w:r/>
+            <w:r>
+              <w:rPr>
+                <w:rFonts w:ascii="Microsoft YaHei" w:hAnsi="Microsoft YaHei" w:eastAsia="Microsoft YaHei"/>
+                <w:b w:val="0"/>
+                <w:i w:val="0"/>
+                <w:color w:val="24364B"/>
+                <w:sz w:val="17"/>
+              </w:rPr>
+              <w:t>3</w:t>
+            </w:r>
           </w:p>
         </w:tc>
         <w:tc>
           <w:tcPr>
-            <w:tcW w:type="dxa" w:w="1296"/>
+            <w:tcW w:type="dxa" w:w="2299"/>
+            <w:shd w:fill="FFFFFF"/>
+            <w:vAlign w:val="center"/>
+            <w:tcMar>
+              <w:top w:w="80" w:type="dxa"/>
+              <w:start w:w="120" w:type="dxa"/>
+              <w:bottom w:w="80" w:type="dxa"/>
+              <w:end w:w="120" w:type="dxa"/>
+            </w:tcMar>
           </w:tcPr>
           <w:p>
+            <w:pPr>
+              <w:spacing w:before="40" w:after="40" w:line="276" w:lineRule="auto"/>
+              <w:jc w:val="center"/>
+            </w:pPr>
             <w:r/>
+            <w:r>
+              <w:rPr>
+                <w:rFonts w:ascii="Microsoft YaHei" w:hAnsi="Microsoft YaHei" w:eastAsia="Microsoft YaHei"/>
+                <w:b w:val="0"/>
+                <w:i w:val="0"/>
+                <w:color w:val="24364B"/>
+                <w:sz w:val="17"/>
+              </w:rPr>
+              <w:t>一致性</w:t>
+            </w:r>
+          </w:p>
+        </w:tc>
+        <w:tc>
+          <w:tcPr>
+            <w:tcW w:type="dxa" w:w="9014"/>
+            <w:shd w:fill="FFFFFF"/>
+            <w:vAlign w:val="center"/>
+            <w:tcMar>
+              <w:top w:w="80" w:type="dxa"/>
+              <w:start w:w="120" w:type="dxa"/>
+              <w:bottom w:w="80" w:type="dxa"/>
+              <w:end w:w="120" w:type="dxa"/>
+            </w:tcMar>
+          </w:tcPr>
+          <w:p>
+            <w:pPr>
+              <w:spacing w:before="40" w:after="40" w:line="276" w:lineRule="auto"/>
+              <w:jc w:val="left"/>
+            </w:pPr>
+            <w:r/>
+            <w:r>
+              <w:rPr>
+                <w:rFonts w:ascii="Microsoft YaHei" w:hAnsi="Microsoft YaHei" w:eastAsia="Microsoft YaHei"/>
+                <w:b w:val="0"/>
+                <w:i w:val="0"/>
+                <w:color w:val="24364B"/>
+                <w:sz w:val="17"/>
+              </w:rPr>
+              <w:t>时序图与接口文档、业务流程和部署方案一致</w:t>
+            </w:r>
+          </w:p>
+        </w:tc>
+        <w:tc>
+          <w:tcPr>
+            <w:tcW w:type="dxa" w:w="2483"/>
+            <w:shd w:fill="FFF9E8"/>
+            <w:vAlign w:val="center"/>
+            <w:tcMar>
+              <w:top w:w="80" w:type="dxa"/>
+              <w:start w:w="120" w:type="dxa"/>
+              <w:bottom w:w="80" w:type="dxa"/>
+              <w:end w:w="120" w:type="dxa"/>
+            </w:tcMar>
+          </w:tcPr>
+          <w:p>
+            <w:pPr>
+              <w:spacing w:before="40" w:after="40" w:line="276" w:lineRule="auto"/>
+              <w:jc w:val="center"/>
+            </w:pPr>
+            <w:r/>
+            <w:r>
+              <w:rPr>
+                <w:rFonts w:ascii="Microsoft YaHei" w:hAnsi="Microsoft YaHei" w:eastAsia="Microsoft YaHei"/>
+                <w:b w:val="0"/>
+                <w:i w:val="0"/>
+                <w:color w:val="24364B"/>
+                <w:sz w:val="17"/>
+              </w:rPr>
+              <w:t>☐ 通过  ☐ 不通过  ☐ 不适用</w:t>
+            </w:r>
+          </w:p>
+        </w:tc>
+      </w:tr>
+    </w:tbl>
+    <w:p>
+      <w:pPr>
+        <w:pStyle w:val="Heading2"/>
+        <w:keepNext/>
+      </w:pPr>
+      <w:r>
+        <w:rPr>
+          <w:rFonts w:ascii="Microsoft YaHei" w:hAnsi="Microsoft YaHei" w:eastAsia="Microsoft YaHei"/>
+          <w:b/>
+          <w:i w:val="0"/>
+          <w:color w:val="1769E0"/>
+          <w:sz w:val="26"/>
+        </w:rPr>
+        <w:t>五、结论与遗留事项</w:t>
+      </w:r>
+    </w:p>
+    <w:tbl>
+      <w:tblPr>
+        <w:tblStyle w:val="TableGrid"/>
+        <w:tblW w:type="dxa" w:w="14900"/>
+        <w:jc w:val="left"/>
+        <w:tblLayout w:type="fixed"/>
+        <w:tblLook w:firstColumn="1" w:firstRow="1" w:lastColumn="0" w:lastRow="0" w:noHBand="0" w:noVBand="1" w:val="04A0"/>
+        <w:tblInd w:w="120" w:type="dxa"/>
+        <w:tblBorders>
+          <w:top w:val="single" w:sz="5" w:color="C8D8EA"/>
+          <w:left w:val="single" w:sz="5" w:color="C8D8EA"/>
+          <w:bottom w:val="single" w:sz="5" w:color="C8D8EA"/>
+          <w:right w:val="single" w:sz="5" w:color="C8D8EA"/>
+          <w:insideH w:val="single" w:sz="5" w:color="C8D8EA"/>
+          <w:insideV w:val="single" w:sz="5" w:color="C8D8EA"/>
+        </w:tblBorders>
+      </w:tblPr>
+      <w:tblGrid>
+        <w:gridCol w:w="1639"/>
+        <w:gridCol w:w="13261"/>
+      </w:tblGrid>
+      <w:tr>
+        <w:trPr>
+          <w:cantSplit/>
+        </w:trPr>
+        <w:tc>
+          <w:tcPr>
+            <w:tcW w:type="dxa" w:w="1639"/>
+            <w:shd w:fill="EDF5FF"/>
+            <w:vAlign w:val="center"/>
+            <w:tcMar>
+              <w:top w:w="80" w:type="dxa"/>
+              <w:start w:w="120" w:type="dxa"/>
+              <w:bottom w:w="80" w:type="dxa"/>
+              <w:end w:w="120" w:type="dxa"/>
+            </w:tcMar>
+          </w:tcPr>
+          <w:p>
+            <w:pPr>
+              <w:spacing w:before="40" w:after="40" w:line="276" w:lineRule="auto"/>
+              <w:jc w:val="center"/>
+            </w:pPr>
+            <w:r/>
+            <w:r>
+              <w:rPr>
+                <w:rFonts w:ascii="Microsoft YaHei" w:hAnsi="Microsoft YaHei" w:eastAsia="Microsoft YaHei"/>
+                <w:b/>
+                <w:i w:val="0"/>
+                <w:color w:val="17365D"/>
+                <w:sz w:val="18"/>
+              </w:rPr>
+              <w:t>总体结论</w:t>
+            </w:r>
+          </w:p>
+        </w:tc>
+        <w:tc>
+          <w:tcPr>
+            <w:tcW w:type="dxa" w:w="13261"/>
+            <w:shd w:fill="FFF9E8"/>
+            <w:vAlign w:val="center"/>
+            <w:tcMar>
+              <w:top w:w="80" w:type="dxa"/>
+              <w:start w:w="120" w:type="dxa"/>
+              <w:bottom w:w="80" w:type="dxa"/>
+              <w:end w:w="120" w:type="dxa"/>
+            </w:tcMar>
+          </w:tcPr>
+          <w:p>
+            <w:pPr>
+              <w:spacing w:before="40" w:after="40" w:line="276" w:lineRule="auto"/>
+              <w:jc w:val="left"/>
+            </w:pPr>
+            <w:r/>
+            <w:r>
+              <w:rPr>
+                <w:rFonts w:ascii="Microsoft YaHei" w:hAnsi="Microsoft YaHei" w:eastAsia="Microsoft YaHei"/>
+                <w:b w:val="0"/>
+                <w:i w:val="0"/>
+                <w:color w:val="24364B"/>
+                <w:sz w:val="18"/>
+              </w:rPr>
+              <w:t>☐ 通过  ☐ 有条件通过  ☐ 不通过</w:t>
+            </w:r>
           </w:p>
         </w:tc>
       </w:tr>
       <w:tr>
+        <w:trPr>
+          <w:cantSplit/>
+        </w:trPr>
         <w:tc>
           <w:tcPr>
-            <w:tcW w:type="dxa" w:w="1296"/>
+            <w:tcW w:type="dxa" w:w="1639"/>
+            <w:shd w:fill="EDF5FF"/>
+            <w:vAlign w:val="center"/>
+            <w:tcMar>
+              <w:top w:w="80" w:type="dxa"/>
+              <w:start w:w="120" w:type="dxa"/>
+              <w:bottom w:w="80" w:type="dxa"/>
+              <w:end w:w="120" w:type="dxa"/>
+            </w:tcMar>
           </w:tcPr>
           <w:p>
+            <w:pPr>
+              <w:spacing w:before="40" w:after="40" w:line="276" w:lineRule="auto"/>
+              <w:jc w:val="center"/>
+            </w:pPr>
             <w:r/>
+            <w:r>
+              <w:rPr>
+                <w:rFonts w:ascii="Microsoft YaHei" w:hAnsi="Microsoft YaHei" w:eastAsia="Microsoft YaHei"/>
+                <w:b/>
+                <w:i w:val="0"/>
+                <w:color w:val="17365D"/>
+                <w:sz w:val="18"/>
+              </w:rPr>
+              <w:t>遗留事项/风险</w:t>
+            </w:r>
           </w:p>
         </w:tc>
         <w:tc>
           <w:tcPr>
-            <w:tcW w:type="dxa" w:w="1296"/>
+            <w:tcW w:type="dxa" w:w="13261"/>
+            <w:shd w:fill="FFF9E8"/>
+            <w:vAlign w:val="center"/>
+            <w:tcMar>
+              <w:top w:w="80" w:type="dxa"/>
+              <w:start w:w="120" w:type="dxa"/>
+              <w:bottom w:w="80" w:type="dxa"/>
+              <w:end w:w="120" w:type="dxa"/>
+            </w:tcMar>
           </w:tcPr>
           <w:p>
+            <w:pPr>
+              <w:spacing w:before="40" w:after="40" w:line="276" w:lineRule="auto"/>
+              <w:jc w:val="left"/>
+            </w:pPr>
             <w:r/>
+            <w:r>
+              <w:rPr>
+                <w:rFonts w:ascii="Microsoft YaHei" w:hAnsi="Microsoft YaHei" w:eastAsia="Microsoft YaHei"/>
+                <w:b w:val="0"/>
+                <w:i w:val="0"/>
+                <w:color w:val="24364B"/>
+                <w:sz w:val="18"/>
+              </w:rPr>
+            </w:r>
+          </w:p>
+        </w:tc>
+      </w:tr>
+      <w:tr>
+        <w:trPr>
+          <w:cantSplit/>
+        </w:trPr>
+        <w:tc>
+          <w:tcPr>
+            <w:tcW w:type="dxa" w:w="1639"/>
+            <w:shd w:fill="EDF5FF"/>
+            <w:vAlign w:val="center"/>
+            <w:tcMar>
+              <w:top w:w="80" w:type="dxa"/>
+              <w:start w:w="120" w:type="dxa"/>
+              <w:bottom w:w="80" w:type="dxa"/>
+              <w:end w:w="120" w:type="dxa"/>
+            </w:tcMar>
+          </w:tcPr>
+          <w:p>
+            <w:pPr>
+              <w:spacing w:before="40" w:after="40" w:line="276" w:lineRule="auto"/>
+              <w:jc w:val="center"/>
+            </w:pPr>
+            <w:r/>
+            <w:r>
+              <w:rPr>
+                <w:rFonts w:ascii="Microsoft YaHei" w:hAnsi="Microsoft YaHei" w:eastAsia="Microsoft YaHei"/>
+                <w:b/>
+                <w:i w:val="0"/>
+                <w:color w:val="17365D"/>
+                <w:sz w:val="18"/>
+              </w:rPr>
+              <w:t>附件与证据</w:t>
+            </w:r>
           </w:p>
         </w:tc>
         <w:tc>
           <w:tcPr>
-            <w:tcW w:type="dxa" w:w="1296"/>
+            <w:tcW w:type="dxa" w:w="13261"/>
+            <w:shd w:fill="FFF9E8"/>
+            <w:vAlign w:val="center"/>
+            <w:tcMar>
+              <w:top w:w="80" w:type="dxa"/>
+              <w:start w:w="120" w:type="dxa"/>
+              <w:bottom w:w="80" w:type="dxa"/>
+              <w:end w:w="120" w:type="dxa"/>
+            </w:tcMar>
           </w:tcPr>
           <w:p>
+            <w:pPr>
+              <w:spacing w:before="40" w:after="40" w:line="276" w:lineRule="auto"/>
+              <w:jc w:val="left"/>
+            </w:pPr>
             <w:r/>
+            <w:r>
+              <w:rPr>
+                <w:rFonts w:ascii="Microsoft YaHei" w:hAnsi="Microsoft YaHei" w:eastAsia="Microsoft YaHei"/>
+                <w:b w:val="0"/>
+                <w:i w:val="0"/>
+                <w:color w:val="24364B"/>
+                <w:sz w:val="18"/>
+              </w:rPr>
+            </w:r>
+          </w:p>
+        </w:tc>
+      </w:tr>
+    </w:tbl>
+    <w:p>
+      <w:pPr>
+        <w:pStyle w:val="Heading2"/>
+        <w:keepNext/>
+      </w:pPr>
+      <w:r>
+        <w:rPr>
+          <w:rFonts w:ascii="Microsoft YaHei" w:hAnsi="Microsoft YaHei" w:eastAsia="Microsoft YaHei"/>
+          <w:b/>
+          <w:i w:val="0"/>
+          <w:color w:val="1769E0"/>
+          <w:sz w:val="26"/>
+        </w:rPr>
+        <w:t>六、审核确认</w:t>
+      </w:r>
+    </w:p>
+    <w:tbl>
+      <w:tblPr>
+        <w:tblStyle w:val="TableGrid"/>
+        <w:tblW w:type="dxa" w:w="14900"/>
+        <w:jc w:val="left"/>
+        <w:tblLayout w:type="fixed"/>
+        <w:tblLook w:firstColumn="1" w:firstRow="1" w:lastColumn="0" w:lastRow="0" w:noHBand="0" w:noVBand="1" w:val="04A0"/>
+        <w:tblInd w:w="120" w:type="dxa"/>
+        <w:tblBorders>
+          <w:top w:val="single" w:sz="5" w:color="C8D8EA"/>
+          <w:left w:val="single" w:sz="5" w:color="C8D8EA"/>
+          <w:bottom w:val="single" w:sz="5" w:color="C8D8EA"/>
+          <w:right w:val="single" w:sz="5" w:color="C8D8EA"/>
+          <w:insideH w:val="single" w:sz="5" w:color="C8D8EA"/>
+          <w:insideV w:val="single" w:sz="5" w:color="C8D8EA"/>
+        </w:tblBorders>
+      </w:tblPr>
+      <w:tblGrid>
+        <w:gridCol w:w="1862"/>
+        <w:gridCol w:w="2682"/>
+        <w:gridCol w:w="8120"/>
+        <w:gridCol w:w="2236"/>
+      </w:tblGrid>
+      <w:tr>
+        <w:trPr>
+          <w:cantSplit/>
+        </w:trPr>
+        <w:tc>
+          <w:tcPr>
+            <w:tcW w:type="dxa" w:w="1862"/>
+            <w:shd w:fill="17365D"/>
+            <w:vAlign w:val="center"/>
+            <w:tcMar>
+              <w:top w:w="80" w:type="dxa"/>
+              <w:start w:w="120" w:type="dxa"/>
+              <w:bottom w:w="80" w:type="dxa"/>
+              <w:end w:w="120" w:type="dxa"/>
+            </w:tcMar>
+          </w:tcPr>
+          <w:p>
+            <w:pPr>
+              <w:spacing w:before="40" w:after="40" w:line="276" w:lineRule="auto"/>
+              <w:jc w:val="center"/>
+            </w:pPr>
+            <w:r/>
+            <w:r>
+              <w:rPr>
+                <w:rFonts w:ascii="Microsoft YaHei" w:hAnsi="Microsoft YaHei" w:eastAsia="Microsoft YaHei"/>
+                <w:b/>
+                <w:i w:val="0"/>
+                <w:color w:val="FFFFFF"/>
+                <w:sz w:val="17"/>
+              </w:rPr>
+              <w:t>确认角色</w:t>
+            </w:r>
           </w:p>
         </w:tc>
         <w:tc>
           <w:tcPr>
-            <w:tcW w:type="dxa" w:w="1296"/>
+            <w:tcW w:type="dxa" w:w="2682"/>
+            <w:shd w:fill="17365D"/>
+            <w:vAlign w:val="center"/>
+            <w:tcMar>
+              <w:top w:w="80" w:type="dxa"/>
+              <w:start w:w="120" w:type="dxa"/>
+              <w:bottom w:w="80" w:type="dxa"/>
+              <w:end w:w="120" w:type="dxa"/>
+            </w:tcMar>
           </w:tcPr>
           <w:p>
+            <w:pPr>
+              <w:spacing w:before="40" w:after="40" w:line="276" w:lineRule="auto"/>
+              <w:jc w:val="center"/>
+            </w:pPr>
             <w:r/>
+            <w:r>
+              <w:rPr>
+                <w:rFonts w:ascii="Microsoft YaHei" w:hAnsi="Microsoft YaHei" w:eastAsia="Microsoft YaHei"/>
+                <w:b/>
+                <w:i w:val="0"/>
+                <w:color w:val="FFFFFF"/>
+                <w:sz w:val="17"/>
+              </w:rPr>
+              <w:t>姓名/签字</w:t>
+            </w:r>
           </w:p>
         </w:tc>
         <w:tc>
           <w:tcPr>
-            <w:tcW w:type="dxa" w:w="1296"/>
+            <w:tcW w:type="dxa" w:w="8120"/>
+            <w:shd w:fill="17365D"/>
+            <w:vAlign w:val="center"/>
+            <w:tcMar>
+              <w:top w:w="80" w:type="dxa"/>
+              <w:start w:w="120" w:type="dxa"/>
+              <w:bottom w:w="80" w:type="dxa"/>
+              <w:end w:w="120" w:type="dxa"/>
+            </w:tcMar>
           </w:tcPr>
           <w:p>
+            <w:pPr>
+              <w:spacing w:before="40" w:after="40" w:line="276" w:lineRule="auto"/>
+              <w:jc w:val="center"/>
+            </w:pPr>
             <w:r/>
+            <w:r>
+              <w:rPr>
+                <w:rFonts w:ascii="Microsoft YaHei" w:hAnsi="Microsoft YaHei" w:eastAsia="Microsoft YaHei"/>
+                <w:b/>
+                <w:i w:val="0"/>
+                <w:color w:val="FFFFFF"/>
+                <w:sz w:val="17"/>
+              </w:rPr>
+              <w:t>确认意见</w:t>
+            </w:r>
           </w:p>
         </w:tc>
         <w:tc>
           <w:tcPr>
-            <w:tcW w:type="dxa" w:w="1296"/>
+            <w:tcW w:type="dxa" w:w="2236"/>
+            <w:shd w:fill="17365D"/>
+            <w:vAlign w:val="center"/>
+            <w:tcMar>
+              <w:top w:w="80" w:type="dxa"/>
+              <w:start w:w="120" w:type="dxa"/>
+              <w:bottom w:w="80" w:type="dxa"/>
+              <w:end w:w="120" w:type="dxa"/>
+            </w:tcMar>
           </w:tcPr>
           <w:p>
+            <w:pPr>
+              <w:spacing w:before="40" w:after="40" w:line="276" w:lineRule="auto"/>
+              <w:jc w:val="center"/>
+            </w:pPr>
             <w:r/>
+            <w:r>
+              <w:rPr>
+                <w:rFonts w:ascii="Microsoft YaHei" w:hAnsi="Microsoft YaHei" w:eastAsia="Microsoft YaHei"/>
+                <w:b/>
+                <w:i w:val="0"/>
+                <w:color w:val="FFFFFF"/>
+                <w:sz w:val="17"/>
+              </w:rPr>
+              <w:t>日期</w:t>
+            </w:r>
+          </w:p>
+        </w:tc>
+      </w:tr>
+      <w:tr>
+        <w:trPr>
+          <w:cantSplit/>
+        </w:trPr>
+        <w:tc>
+          <w:tcPr>
+            <w:tcW w:type="dxa" w:w="1862"/>
+            <w:shd w:fill="EDF5FF"/>
+            <w:vAlign w:val="center"/>
+            <w:tcMar>
+              <w:top w:w="80" w:type="dxa"/>
+              <w:start w:w="120" w:type="dxa"/>
+              <w:bottom w:w="80" w:type="dxa"/>
+              <w:end w:w="120" w:type="dxa"/>
+            </w:tcMar>
+          </w:tcPr>
+          <w:p>
+            <w:pPr>
+              <w:spacing w:before="40" w:after="40" w:line="276" w:lineRule="auto"/>
+              <w:jc w:val="center"/>
+            </w:pPr>
+            <w:r/>
+            <w:r>
+              <w:rPr>
+                <w:rFonts w:ascii="Microsoft YaHei" w:hAnsi="Microsoft YaHei" w:eastAsia="Microsoft YaHei"/>
+                <w:b/>
+                <w:i w:val="0"/>
+                <w:color w:val="17365D"/>
+                <w:sz w:val="17"/>
+              </w:rPr>
+              <w:t>实施方负责人</w:t>
+            </w:r>
           </w:p>
         </w:tc>
         <w:tc>
           <w:tcPr>
-            <w:tcW w:type="dxa" w:w="1296"/>
+            <w:tcW w:type="dxa" w:w="2682"/>
+            <w:shd w:fill="FFF9E8"/>
+            <w:vAlign w:val="center"/>
+            <w:tcMar>
+              <w:top w:w="80" w:type="dxa"/>
+              <w:start w:w="120" w:type="dxa"/>
+              <w:bottom w:w="80" w:type="dxa"/>
+              <w:end w:w="120" w:type="dxa"/>
+            </w:tcMar>
           </w:tcPr>
           <w:p>
+            <w:pPr>
+              <w:spacing w:before="40" w:after="40" w:line="276" w:lineRule="auto"/>
+              <w:jc w:val="center"/>
+            </w:pPr>
             <w:r/>
+            <w:r>
+              <w:rPr>
+                <w:rFonts w:ascii="Microsoft YaHei" w:hAnsi="Microsoft YaHei" w:eastAsia="Microsoft YaHei"/>
+                <w:b w:val="0"/>
+                <w:i w:val="0"/>
+                <w:color w:val="24364B"/>
+                <w:sz w:val="17"/>
+              </w:rPr>
+            </w:r>
           </w:p>
         </w:tc>
         <w:tc>
           <w:tcPr>
-            <w:tcW w:type="dxa" w:w="1296"/>
+            <w:tcW w:type="dxa" w:w="8120"/>
+            <w:shd w:fill="FFF9E8"/>
+            <w:vAlign w:val="center"/>
+            <w:tcMar>
+              <w:top w:w="80" w:type="dxa"/>
+              <w:start w:w="120" w:type="dxa"/>
+              <w:bottom w:w="80" w:type="dxa"/>
+              <w:end w:w="120" w:type="dxa"/>
+            </w:tcMar>
           </w:tcPr>
           <w:p>
+            <w:pPr>
+              <w:spacing w:before="40" w:after="40" w:line="276" w:lineRule="auto"/>
+              <w:jc w:val="left"/>
+            </w:pPr>
             <w:r/>
+            <w:r>
+              <w:rPr>
+                <w:rFonts w:ascii="Microsoft YaHei" w:hAnsi="Microsoft YaHei" w:eastAsia="Microsoft YaHei"/>
+                <w:b w:val="0"/>
+                <w:i w:val="0"/>
+                <w:color w:val="24364B"/>
+                <w:sz w:val="17"/>
+              </w:rPr>
+            </w:r>
+          </w:p>
+        </w:tc>
+        <w:tc>
+          <w:tcPr>
+            <w:tcW w:type="dxa" w:w="2236"/>
+            <w:shd w:fill="FFF9E8"/>
+            <w:vAlign w:val="center"/>
+            <w:tcMar>
+              <w:top w:w="80" w:type="dxa"/>
+              <w:start w:w="120" w:type="dxa"/>
+              <w:bottom w:w="80" w:type="dxa"/>
+              <w:end w:w="120" w:type="dxa"/>
+            </w:tcMar>
+          </w:tcPr>
+          <w:p>
+            <w:pPr>
+              <w:spacing w:before="40" w:after="40" w:line="276" w:lineRule="auto"/>
+              <w:jc w:val="center"/>
+            </w:pPr>
+            <w:r/>
+            <w:r>
+              <w:rPr>
+                <w:rFonts w:ascii="Microsoft YaHei" w:hAnsi="Microsoft YaHei" w:eastAsia="Microsoft YaHei"/>
+                <w:b w:val="0"/>
+                <w:i w:val="0"/>
+                <w:color w:val="24364B"/>
+                <w:sz w:val="17"/>
+              </w:rPr>
+            </w:r>
           </w:p>
         </w:tc>
       </w:tr>
       <w:tr>
+        <w:trPr>
+          <w:cantSplit/>
+        </w:trPr>
         <w:tc>
           <w:tcPr>
-            <w:tcW w:type="dxa" w:w="1296"/>
+            <w:tcW w:type="dxa" w:w="1862"/>
+            <w:shd w:fill="EDF5FF"/>
+            <w:vAlign w:val="center"/>
+            <w:tcMar>
+              <w:top w:w="80" w:type="dxa"/>
+              <w:start w:w="120" w:type="dxa"/>
+              <w:bottom w:w="80" w:type="dxa"/>
+              <w:end w:w="120" w:type="dxa"/>
+            </w:tcMar>
           </w:tcPr>
           <w:p>
+            <w:pPr>
+              <w:spacing w:before="40" w:after="40" w:line="276" w:lineRule="auto"/>
+              <w:jc w:val="center"/>
+            </w:pPr>
             <w:r/>
+            <w:r>
+              <w:rPr>
+                <w:rFonts w:ascii="Microsoft YaHei" w:hAnsi="Microsoft YaHei" w:eastAsia="Microsoft YaHei"/>
+                <w:b/>
+                <w:i w:val="0"/>
+                <w:color w:val="17365D"/>
+                <w:sz w:val="17"/>
+              </w:rPr>
+              <w:t>客户项目负责人</w:t>
+            </w:r>
           </w:p>
         </w:tc>
         <w:tc>
           <w:tcPr>
-            <w:tcW w:type="dxa" w:w="1296"/>
+            <w:tcW w:type="dxa" w:w="2682"/>
+            <w:shd w:fill="FFF9E8"/>
+            <w:vAlign w:val="center"/>
+            <w:tcMar>
+              <w:top w:w="80" w:type="dxa"/>
+              <w:start w:w="120" w:type="dxa"/>
+              <w:bottom w:w="80" w:type="dxa"/>
+              <w:end w:w="120" w:type="dxa"/>
+            </w:tcMar>
           </w:tcPr>
           <w:p>
+            <w:pPr>
+              <w:spacing w:before="40" w:after="40" w:line="276" w:lineRule="auto"/>
+              <w:jc w:val="center"/>
+            </w:pPr>
             <w:r/>
+            <w:r>
+              <w:rPr>
+                <w:rFonts w:ascii="Microsoft YaHei" w:hAnsi="Microsoft YaHei" w:eastAsia="Microsoft YaHei"/>
+                <w:b w:val="0"/>
+                <w:i w:val="0"/>
+                <w:color w:val="24364B"/>
+                <w:sz w:val="17"/>
+              </w:rPr>
+            </w:r>
           </w:p>
         </w:tc>
         <w:tc>
           <w:tcPr>
-            <w:tcW w:type="dxa" w:w="1296"/>
+            <w:tcW w:type="dxa" w:w="8120"/>
+            <w:shd w:fill="FFF9E8"/>
+            <w:vAlign w:val="center"/>
+            <w:tcMar>
+              <w:top w:w="80" w:type="dxa"/>
+              <w:start w:w="120" w:type="dxa"/>
+              <w:bottom w:w="80" w:type="dxa"/>
+              <w:end w:w="120" w:type="dxa"/>
+            </w:tcMar>
           </w:tcPr>
           <w:p>
+            <w:pPr>
+              <w:spacing w:before="40" w:after="40" w:line="276" w:lineRule="auto"/>
+              <w:jc w:val="left"/>
+            </w:pPr>
             <w:r/>
+            <w:r>
+              <w:rPr>
+                <w:rFonts w:ascii="Microsoft YaHei" w:hAnsi="Microsoft YaHei" w:eastAsia="Microsoft YaHei"/>
+                <w:b w:val="0"/>
+                <w:i w:val="0"/>
+                <w:color w:val="24364B"/>
+                <w:sz w:val="17"/>
+              </w:rPr>
+            </w:r>
           </w:p>
         </w:tc>
         <w:tc>
           <w:tcPr>
-            <w:tcW w:type="dxa" w:w="1296"/>
+            <w:tcW w:type="dxa" w:w="2236"/>
+            <w:shd w:fill="FFF9E8"/>
+            <w:vAlign w:val="center"/>
+            <w:tcMar>
+              <w:top w:w="80" w:type="dxa"/>
+              <w:start w:w="120" w:type="dxa"/>
+              <w:bottom w:w="80" w:type="dxa"/>
+              <w:end w:w="120" w:type="dxa"/>
+            </w:tcMar>
           </w:tcPr>
           <w:p>
+            <w:pPr>
+              <w:spacing w:before="40" w:after="40" w:line="276" w:lineRule="auto"/>
+              <w:jc w:val="center"/>
+            </w:pPr>
             <w:r/>
+            <w:r>
+              <w:rPr>
+                <w:rFonts w:ascii="Microsoft YaHei" w:hAnsi="Microsoft YaHei" w:eastAsia="Microsoft YaHei"/>
+                <w:b w:val="0"/>
+                <w:i w:val="0"/>
+                <w:color w:val="24364B"/>
+                <w:sz w:val="17"/>
+              </w:rPr>
+            </w:r>
+          </w:p>
+        </w:tc>
+      </w:tr>
+      <w:tr>
+        <w:trPr>
+          <w:cantSplit/>
+        </w:trPr>
+        <w:tc>
+          <w:tcPr>
+            <w:tcW w:type="dxa" w:w="1862"/>
+            <w:shd w:fill="EDF5FF"/>
+            <w:vAlign w:val="center"/>
+            <w:tcMar>
+              <w:top w:w="80" w:type="dxa"/>
+              <w:start w:w="120" w:type="dxa"/>
+              <w:bottom w:w="80" w:type="dxa"/>
+              <w:end w:w="120" w:type="dxa"/>
+            </w:tcMar>
+          </w:tcPr>
+          <w:p>
+            <w:pPr>
+              <w:spacing w:before="40" w:after="40" w:line="276" w:lineRule="auto"/>
+              <w:jc w:val="center"/>
+            </w:pPr>
+            <w:r/>
+            <w:r>
+              <w:rPr>
+                <w:rFonts w:ascii="Microsoft YaHei" w:hAnsi="Microsoft YaHei" w:eastAsia="Microsoft YaHei"/>
+                <w:b/>
+                <w:i w:val="0"/>
+                <w:color w:val="17365D"/>
+                <w:sz w:val="17"/>
+              </w:rPr>
+              <w:t>业务/信息部门</w:t>
+            </w:r>
           </w:p>
         </w:tc>
         <w:tc>
           <w:tcPr>
-            <w:tcW w:type="dxa" w:w="1296"/>
+            <w:tcW w:type="dxa" w:w="2682"/>
+            <w:shd w:fill="FFF9E8"/>
+            <w:vAlign w:val="center"/>
+            <w:tcMar>
+              <w:top w:w="80" w:type="dxa"/>
+              <w:start w:w="120" w:type="dxa"/>
+              <w:bottom w:w="80" w:type="dxa"/>
+              <w:end w:w="120" w:type="dxa"/>
+            </w:tcMar>
           </w:tcPr>
           <w:p>
+            <w:pPr>
+              <w:spacing w:before="40" w:after="40" w:line="276" w:lineRule="auto"/>
+              <w:jc w:val="center"/>
+            </w:pPr>
             <w:r/>
+            <w:r>
+              <w:rPr>
+                <w:rFonts w:ascii="Microsoft YaHei" w:hAnsi="Microsoft YaHei" w:eastAsia="Microsoft YaHei"/>
+                <w:b w:val="0"/>
+                <w:i w:val="0"/>
+                <w:color w:val="24364B"/>
+                <w:sz w:val="17"/>
+              </w:rPr>
+            </w:r>
           </w:p>
         </w:tc>
         <w:tc>
           <w:tcPr>
-            <w:tcW w:type="dxa" w:w="1296"/>
+            <w:tcW w:type="dxa" w:w="8120"/>
+            <w:shd w:fill="FFF9E8"/>
+            <w:vAlign w:val="center"/>
+            <w:tcMar>
+              <w:top w:w="80" w:type="dxa"/>
+              <w:start w:w="120" w:type="dxa"/>
+              <w:bottom w:w="80" w:type="dxa"/>
+              <w:end w:w="120" w:type="dxa"/>
+            </w:tcMar>
           </w:tcPr>
           <w:p>
+            <w:pPr>
+              <w:spacing w:before="40" w:after="40" w:line="276" w:lineRule="auto"/>
+              <w:jc w:val="left"/>
+            </w:pPr>
             <w:r/>
+            <w:r>
+              <w:rPr>
+                <w:rFonts w:ascii="Microsoft YaHei" w:hAnsi="Microsoft YaHei" w:eastAsia="Microsoft YaHei"/>
+                <w:b w:val="0"/>
+                <w:i w:val="0"/>
+                <w:color w:val="24364B"/>
+                <w:sz w:val="17"/>
+              </w:rPr>
+            </w:r>
           </w:p>
         </w:tc>
         <w:tc>
           <w:tcPr>
-            <w:tcW w:type="dxa" w:w="1296"/>
+            <w:tcW w:type="dxa" w:w="2236"/>
+            <w:shd w:fill="FFF9E8"/>
+            <w:vAlign w:val="center"/>
+            <w:tcMar>
+              <w:top w:w="80" w:type="dxa"/>
+              <w:start w:w="120" w:type="dxa"/>
+              <w:bottom w:w="80" w:type="dxa"/>
+              <w:end w:w="120" w:type="dxa"/>
+            </w:tcMar>
           </w:tcPr>
           <w:p>
+            <w:pPr>
+              <w:spacing w:before="40" w:after="40" w:line="276" w:lineRule="auto"/>
+              <w:jc w:val="center"/>
+            </w:pPr>
             <w:r/>
-          </w:p>
-        </w:tc>
-        <w:tc>
-          <w:tcPr>
-            <w:tcW w:type="dxa" w:w="1296"/>
-          </w:tcPr>
-          <w:p>
-            <w:r/>
-          </w:p>
-        </w:tc>
-      </w:tr>
-      <w:tr>
-        <w:tc>
-          <w:tcPr>
-            <w:tcW w:type="dxa" w:w="1296"/>
-          </w:tcPr>
-          <w:p>
-            <w:r/>
-          </w:p>
-        </w:tc>
-        <w:tc>
-          <w:tcPr>
-            <w:tcW w:type="dxa" w:w="1296"/>
-          </w:tcPr>
-          <w:p>
-            <w:r/>
-          </w:p>
-        </w:tc>
-        <w:tc>
-          <w:tcPr>
-            <w:tcW w:type="dxa" w:w="1296"/>
-          </w:tcPr>
-          <w:p>
-            <w:r/>
-          </w:p>
-        </w:tc>
-        <w:tc>
-          <w:tcPr>
-            <w:tcW w:type="dxa" w:w="1296"/>
-          </w:tcPr>
-          <w:p>
-            <w:r/>
-          </w:p>
-        </w:tc>
-        <w:tc>
-          <w:tcPr>
-            <w:tcW w:type="dxa" w:w="1296"/>
-          </w:tcPr>
-          <w:p>
-            <w:r/>
-          </w:p>
-        </w:tc>
-        <w:tc>
-          <w:tcPr>
-            <w:tcW w:type="dxa" w:w="1296"/>
-          </w:tcPr>
-          <w:p>
-            <w:r/>
-          </w:p>
-        </w:tc>
-        <w:tc>
-          <w:tcPr>
-            <w:tcW w:type="dxa" w:w="1296"/>
-          </w:tcPr>
-          <w:p>
-            <w:r/>
-          </w:p>
-        </w:tc>
-        <w:tc>
-          <w:tcPr>
-            <w:tcW w:type="dxa" w:w="1296"/>
-          </w:tcPr>
-          <w:p>
-            <w:r/>
-          </w:p>
-        </w:tc>
-      </w:tr>
-      <w:tr>
-        <w:tc>
-          <w:tcPr>
-            <w:tcW w:type="dxa" w:w="1296"/>
-          </w:tcPr>
-          <w:p>
-            <w:r/>
-          </w:p>
-        </w:tc>
-        <w:tc>
-          <w:tcPr>
-            <w:tcW w:type="dxa" w:w="1296"/>
-          </w:tcPr>
-          <w:p>
-            <w:r/>
-          </w:p>
-        </w:tc>
-        <w:tc>
-          <w:tcPr>
-            <w:tcW w:type="dxa" w:w="1296"/>
-          </w:tcPr>
-          <w:p>
-            <w:r/>
-          </w:p>
-        </w:tc>
-        <w:tc>
-          <w:tcPr>
-            <w:tcW w:type="dxa" w:w="1296"/>
-          </w:tcPr>
-          <w:p>
-            <w:r/>
-          </w:p>
-        </w:tc>
-        <w:tc>
-          <w:tcPr>
-            <w:tcW w:type="dxa" w:w="1296"/>
-          </w:tcPr>
-          <w:p>
-            <w:r/>
-          </w:p>
-        </w:tc>
-        <w:tc>
-          <w:tcPr>
-            <w:tcW w:type="dxa" w:w="1296"/>
-          </w:tcPr>
-          <w:p>
-            <w:r/>
-          </w:p>
-        </w:tc>
-        <w:tc>
-          <w:tcPr>
-            <w:tcW w:type="dxa" w:w="1296"/>
-          </w:tcPr>
-          <w:p>
-            <w:r/>
-          </w:p>
-        </w:tc>
-        <w:tc>
-          <w:tcPr>
-            <w:tcW w:type="dxa" w:w="1296"/>
-          </w:tcPr>
-          <w:p>
-            <w:r/>
+            <w:r>
+              <w:rPr>
+                <w:rFonts w:ascii="Microsoft YaHei" w:hAnsi="Microsoft YaHei" w:eastAsia="Microsoft YaHei"/>
+                <w:b w:val="0"/>
+                <w:i w:val="0"/>
+                <w:color w:val="24364B"/>
+                <w:sz w:val="17"/>
+              </w:rPr>
+            </w:r>
           </w:p>
         </w:tc>
       </w:tr>
     </w:tbl>
-    <w:p/>
-    <w:p>
-      <w:r>
-        <w:rPr>
-          <w:b/>
-        </w:rPr>
-        <w:t>备注/结论：</w:t>
-      </w:r>
-    </w:p>
-    <w:p>
-      <w:r>
-        <w:br/>
-        <w:br/>
-      </w:r>
-    </w:p>
     <w:p>
       <w:pPr>
+        <w:spacing w:before="120" w:after="0"/>
         <w:jc w:val="right"/>
       </w:pPr>
       <w:r>
-        <w:t>编制：____________    审核：____________    确认日期：____________</w:t>
+        <w:rPr>
+          <w:rFonts w:ascii="Microsoft YaHei" w:hAnsi="Microsoft YaHei" w:eastAsia="Microsoft YaHei"/>
+          <w:b w:val="0"/>
+          <w:i w:val="0"/>
+          <w:color w:val="667A90"/>
+          <w:sz w:val="16"/>
+        </w:rPr>
+        <w:t>版本记录：V2.0 · 蓝白医疗信息化模板首版 · 2026-07-28</w:t>
       </w:r>
     </w:p>
     <w:sectPr>
-      <w:pgSz w:w="12240" w:h="15840"/>
-      <w:pgMar w:top="936" w:right="936" w:bottom="936" w:left="936" w:header="720" w:footer="720" w:gutter="0"/>
+      <w:headerReference w:type="default" r:id="rId9"/>
+      <w:footerReference w:type="default" r:id="rId10"/>
+      <w:pgSz w:w="16834" w:h="11909" w:orient="landscape"/>
+      <w:pgMar w:top="864" w:right="936" w:bottom="864" w:left="936" w:header="432" w:footer="432" w:gutter="0"/>
       <w:cols w:space="720"/>
       <w:docGrid w:linePitch="360"/>
     </w:sectPr>
   </w:body>
 </w:document>
+</file>
+
+<file path=word/footer1.xml><?xml version="1.0" encoding="utf-8"?>
+<w:ftr xmlns:m="http://schemas.openxmlformats.org/officeDocument/2006/math" xmlns:mc="http://schemas.openxmlformats.org/markup-compatibility/2006" xmlns:mo="http://schemas.microsoft.com/office/mac/office/2008/main" xmlns:mv="urn:schemas-microsoft-com:mac:vml" xmlns:o="urn:schemas-microsoft-com:office:office" xmlns:r="http://schemas.openxmlformats.org/officeDocument/2006/relationships" xmlns:v="urn:schemas-microsoft-com:vml" xmlns:w10="urn:schemas-microsoft-com:office:word" xmlns:w14="http://schemas.microsoft.com/office/word/2010/wordml" xmlns:w="http://schemas.openxmlformats.org/wordprocessingml/2006/main" xmlns:wne="http://schemas.microsoft.com/office/word/2006/wordml" xmlns:wp14="http://schemas.microsoft.com/office/word/2010/wordprocessingDrawing" xmlns:wp="http://schemas.openxmlformats.org/drawingml/2006/wordprocessingDrawing" xmlns:wpc="http://schemas.microsoft.com/office/word/2010/wordprocessingCanvas" xmlns:wpg="http://schemas.microsoft.com/office/word/2010/wordprocessingGroup" xmlns:wpi="http://schemas.microsoft.com/office/word/2010/wordprocessingInk" xmlns:wps="http://schemas.microsoft.com/office/word/2010/wordprocessingShape" mc:Ignorable="w14 wp14">
+  <w:p>
+    <w:pPr>
+      <w:pStyle w:val="Footer"/>
+      <w:spacing w:before="0" w:after="0"/>
+      <w:jc w:val="right"/>
+    </w:pPr>
+    <w:r>
+      <w:rPr>
+        <w:rFonts w:ascii="Microsoft YaHei" w:hAnsi="Microsoft YaHei" w:eastAsia="Microsoft YaHei"/>
+        <w:b w:val="0"/>
+        <w:i w:val="0"/>
+        <w:color w:val="667A90"/>
+        <w:sz w:val="17"/>
+      </w:rPr>
+      <w:t xml:space="preserve">第 </w:t>
+      <w:fldChar w:fldCharType="begin"/>
+      <w:instrText xml:space="preserve"> PAGE </w:instrText>
+      <w:fldChar w:fldCharType="end"/>
+    </w:r>
+    <w:r>
+      <w:rPr>
+        <w:rFonts w:ascii="Microsoft YaHei" w:hAnsi="Microsoft YaHei" w:eastAsia="Microsoft YaHei"/>
+        <w:b w:val="0"/>
+        <w:i w:val="0"/>
+        <w:color w:val="667A90"/>
+        <w:sz w:val="17"/>
+      </w:rPr>
+      <w:t xml:space="preserve"> 页</w:t>
+    </w:r>
+  </w:p>
+</w:ftr>
+</file>
+
+<file path=word/header1.xml><?xml version="1.0" encoding="utf-8"?>
+<w:hdr xmlns:m="http://schemas.openxmlformats.org/officeDocument/2006/math" xmlns:mc="http://schemas.openxmlformats.org/markup-compatibility/2006" xmlns:mo="http://schemas.microsoft.com/office/mac/office/2008/main" xmlns:mv="urn:schemas-microsoft-com:mac:vml" xmlns:o="urn:schemas-microsoft-com:office:office" xmlns:r="http://schemas.openxmlformats.org/officeDocument/2006/relationships" xmlns:v="urn:schemas-microsoft-com:vml" xmlns:w10="urn:schemas-microsoft-com:office:word" xmlns:w14="http://schemas.microsoft.com/office/word/2010/wordml" xmlns:w="http://schemas.openxmlformats.org/wordprocessingml/2006/main" xmlns:wne="http://schemas.microsoft.com/office/word/2006/wordml" xmlns:wp14="http://schemas.microsoft.com/office/word/2010/wordprocessingDrawing" xmlns:wp="http://schemas.openxmlformats.org/drawingml/2006/wordprocessingDrawing" xmlns:wpc="http://schemas.microsoft.com/office/word/2010/wordprocessingCanvas" xmlns:wpg="http://schemas.microsoft.com/office/word/2010/wordprocessingGroup" xmlns:wpi="http://schemas.microsoft.com/office/word/2010/wordprocessingInk" xmlns:wps="http://schemas.microsoft.com/office/word/2010/wordprocessingShape" mc:Ignorable="w14 wp14">
+  <w:p>
+    <w:pPr>
+      <w:pStyle w:val="Header"/>
+    </w:pPr>
+  </w:p>
+  <w:tbl>
+    <w:tblPr>
+      <w:tblW w:type="dxa" w:w="14900"/>
+      <w:jc w:val="left"/>
+      <w:tblLayout w:type="fixed"/>
+      <w:tblLook w:firstColumn="1" w:firstRow="1" w:lastColumn="0" w:lastRow="0" w:noHBand="0" w:noVBand="1" w:val="04A0"/>
+      <w:tblInd w:w="120" w:type="dxa"/>
+      <w:tblBorders>
+        <w:top w:val="single" w:sz="0" w:color="FFFFFF"/>
+        <w:left w:val="single" w:sz="0" w:color="FFFFFF"/>
+        <w:bottom w:val="single" w:sz="0" w:color="FFFFFF"/>
+        <w:right w:val="single" w:sz="0" w:color="FFFFFF"/>
+        <w:insideH w:val="single" w:sz="0" w:color="FFFFFF"/>
+        <w:insideV w:val="single" w:sz="0" w:color="FFFFFF"/>
+      </w:tblBorders>
+    </w:tblPr>
+    <w:tblGrid>
+      <w:gridCol w:w="7450"/>
+      <w:gridCol w:w="7450"/>
+    </w:tblGrid>
+    <w:tr>
+      <w:trPr>
+        <w:cantSplit/>
+      </w:trPr>
+      <w:tc>
+        <w:tcPr>
+          <w:tcW w:type="dxa" w:w="7450"/>
+          <w:vAlign w:val="center"/>
+          <w:tcMar>
+            <w:top w:w="80" w:type="dxa"/>
+            <w:start w:w="120" w:type="dxa"/>
+            <w:bottom w:w="80" w:type="dxa"/>
+            <w:end w:w="120" w:type="dxa"/>
+          </w:tcMar>
+        </w:tcPr>
+        <w:p>
+          <w:pPr>
+            <w:spacing w:before="40" w:after="40" w:line="276" w:lineRule="auto"/>
+            <w:jc w:val="left"/>
+          </w:pPr>
+          <w:r/>
+          <w:r>
+            <w:rPr>
+              <w:rFonts w:ascii="Microsoft YaHei" w:hAnsi="Microsoft YaHei" w:eastAsia="Microsoft YaHei"/>
+              <w:b/>
+              <w:i w:val="0"/>
+              <w:color w:val="667A90"/>
+              <w:sz w:val="17"/>
+            </w:rPr>
+            <w:t>实施项目管理平台 · SOP 交付物</w:t>
+          </w:r>
+        </w:p>
+      </w:tc>
+      <w:tc>
+        <w:tcPr>
+          <w:tcW w:type="dxa" w:w="7450"/>
+          <w:vAlign w:val="center"/>
+          <w:tcMar>
+            <w:top w:w="80" w:type="dxa"/>
+            <w:start w:w="120" w:type="dxa"/>
+            <w:bottom w:w="80" w:type="dxa"/>
+            <w:end w:w="120" w:type="dxa"/>
+          </w:tcMar>
+        </w:tcPr>
+        <w:p>
+          <w:pPr>
+            <w:spacing w:before="40" w:after="40" w:line="276" w:lineRule="auto"/>
+            <w:jc w:val="right"/>
+          </w:pPr>
+          <w:r/>
+          <w:r>
+            <w:rPr>
+              <w:rFonts w:ascii="Microsoft YaHei" w:hAnsi="Microsoft YaHei" w:eastAsia="Microsoft YaHei"/>
+              <w:b w:val="0"/>
+              <w:i w:val="0"/>
+              <w:color w:val="667A90"/>
+              <w:sz w:val="17"/>
+            </w:rPr>
+            <w:t>时序图（评审确认版）  |  V2.0</w:t>
+          </w:r>
+        </w:p>
+      </w:tc>
+    </w:tr>
+  </w:tbl>
+</w:hdr>
 </file>
 
 <file path=word/numbering.xml><?xml version="1.0" encoding="utf-8"?>
@@ -1195,9 +4578,13 @@
     <w:name w:val="Normal"/>
     <w:qFormat/>
     <w:rsid w:val="00FC693F"/>
+    <w:pPr>
+      <w:spacing w:before="0" w:after="120" w:line="300" w:lineRule="auto"/>
+    </w:pPr>
     <w:rPr>
       <w:rFonts w:ascii="Microsoft YaHei" w:hAnsi="Microsoft YaHei" w:eastAsia="Microsoft YaHei"/>
-      <w:sz w:val="18"/>
+      <w:color w:val="24364B"/>
+      <w:sz w:val="22"/>
     </w:rPr>
   </w:style>
   <w:style w:type="paragraph" w:styleId="Header">
@@ -1255,15 +4642,15 @@
     <w:pPr>
       <w:keepNext/>
       <w:keepLines/>
-      <w:spacing w:before="480" w:after="0"/>
+      <w:spacing w:before="360" w:after="200"/>
       <w:outlineLvl w:val="0"/>
     </w:pPr>
     <w:rPr>
-      <w:rFonts w:asciiTheme="majorHAnsi" w:eastAsiaTheme="majorEastAsia" w:hAnsiTheme="majorHAnsi" w:cstheme="majorBidi"/>
+      <w:rFonts w:asciiTheme="majorHAnsi" w:eastAsiaTheme="majorEastAsia" w:hAnsiTheme="majorHAnsi" w:cstheme="majorBidi" w:ascii="Microsoft YaHei" w:hAnsi="Microsoft YaHei" w:eastAsia="Microsoft YaHei"/>
       <w:b/>
       <w:bCs/>
-      <w:color w:val="365F91" w:themeColor="accent1" w:themeShade="BF"/>
-      <w:sz w:val="28"/>
+      <w:color w:val="17365D"/>
+      <w:sz w:val="32"/>
       <w:szCs w:val="28"/>
     </w:rPr>
   </w:style>
@@ -1279,14 +4666,14 @@
     <w:pPr>
       <w:keepNext/>
       <w:keepLines/>
-      <w:spacing w:before="200" w:after="0"/>
+      <w:spacing w:before="280" w:after="140"/>
       <w:outlineLvl w:val="1"/>
     </w:pPr>
     <w:rPr>
-      <w:rFonts w:asciiTheme="majorHAnsi" w:eastAsiaTheme="majorEastAsia" w:hAnsiTheme="majorHAnsi" w:cstheme="majorBidi"/>
+      <w:rFonts w:asciiTheme="majorHAnsi" w:eastAsiaTheme="majorEastAsia" w:hAnsiTheme="majorHAnsi" w:cstheme="majorBidi" w:ascii="Microsoft YaHei" w:hAnsi="Microsoft YaHei" w:eastAsia="Microsoft YaHei"/>
       <w:b/>
       <w:bCs/>
-      <w:color w:val="4F81BD" w:themeColor="accent1"/>
+      <w:color w:val="1769E0"/>
       <w:sz w:val="26"/>
       <w:szCs w:val="26"/>
     </w:rPr>
@@ -1303,14 +4690,15 @@
     <w:pPr>
       <w:keepNext/>
       <w:keepLines/>
-      <w:spacing w:before="200" w:after="0"/>
+      <w:spacing w:before="200" w:after="100"/>
       <w:outlineLvl w:val="2"/>
     </w:pPr>
     <w:rPr>
-      <w:rFonts w:asciiTheme="majorHAnsi" w:eastAsiaTheme="majorEastAsia" w:hAnsiTheme="majorHAnsi" w:cstheme="majorBidi"/>
+      <w:rFonts w:asciiTheme="majorHAnsi" w:eastAsiaTheme="majorEastAsia" w:hAnsiTheme="majorHAnsi" w:cstheme="majorBidi" w:ascii="Microsoft YaHei" w:hAnsi="Microsoft YaHei" w:eastAsia="Microsoft YaHei"/>
       <w:b/>
       <w:bCs/>
-      <w:color w:val="4F81BD" w:themeColor="accent1"/>
+      <w:color w:val="17365D"/>
+      <w:sz w:val="24"/>
     </w:rPr>
   </w:style>
   <w:style w:type="paragraph" w:styleId="Heading4">

</xml_diff>